<commit_message>
Cronograma ajustado del 14 de octubre y ajustes a los talleres con fechas nuevas
Co-Authored-By: Claude Fable 5.1 <noreply@anthropic.com>
Claude-Session: https://claude.ai/code/session_01Ja1vbRoiAwxTq3mLFGrVau
</commit_message>
<xml_diff>
--- a/formacion/Ajustes a los talleres · diagnóstico y política de IA.docx
+++ b/formacion/Ajustes a los talleres · diagnóstico y política de IA.docx
@@ -82,7 +82,7 @@
           <w:sz w:val="21"/>
           <w:szCs w:val="21"/>
         </w:rPr>
-        <w:t xml:space="preserve">Pivot Power · documento de trabajo para la dirección del programa y los dos docentes · 14 de octubre de 2026</w:t>
+        <w:t xml:space="preserve">Pivot Power · documento de trabajo para la dirección del programa y los dos docentes · 14 de octubre de 2026 · fechas según el cronograma ajustado del 14 de octubre</w:t>
       </w:r>
     </w:p>
     <w:p>
@@ -191,7 +191,7 @@
                 <w:sz w:val="20"/>
                 <w:szCs w:val="20"/>
               </w:rPr>
-              <w:t xml:space="preserve">El Taller 1 comercial ya tuvo su primer encuentro el 9 de octubre y el administrativo lo tiene hoy. Los ajustes del Taller 1 aplican al encuentro 2, al kit del participante y a los retos.</w:t>
+              <w:t xml:space="preserve">Con las fechas corridas una semana, el Taller 1 comercial arranca el viernes 16 de octubre y el administrativo el miércoles 21. Los ajustes del Taller 1 entran completos en los dos encuentros, en el kit del participante y en los retos.</w:t>
             </w:r>
           </w:p>
         </w:tc>
@@ -1287,7 +1287,7 @@
           <w:sz w:val="21"/>
           <w:szCs w:val="21"/>
         </w:rPr>
-        <w:t xml:space="preserve">329 personas escribieron qué esperan de la IA: ahorrar tiempo (38 %), organizar pendientes (23 %), cotizaciones y ventas (14 %), automatizar lo repetitivo (11 %). Una respuesta marca el límite que ellos mismos ponen: «No me gusta que la IA reemplace mi pensar, análisis y criterio». Esa frase abre el encuentro 2 de los dos perfiles.</w:t>
+        <w:t xml:space="preserve">329 personas escribieron qué esperan de la IA: ahorrar tiempo (38 %), organizar pendientes (23 %), cotizaciones y ventas (14 %), automatizar lo repetitivo (11 %). Una respuesta marca el límite que ellos mismos ponen: «No me gusta que la IA reemplace mi pensar, análisis y criterio». Esa frase abre el encuentro 1 de los dos perfiles.</w:t>
       </w:r>
     </w:p>
     <w:p>
@@ -2098,7 +2098,7 @@
                 <w:sz w:val="20"/>
                 <w:szCs w:val="20"/>
               </w:rPr>
-              <w:t xml:space="preserve">El documento está emitido por GYJ Ferreterías S.A. y su alcance cubre al personal de esa empresa. El programa forma a siete empresas. Antes de enseñar la política como «la regla de G&amp;J», hace falta saber si Soluciones, Ramírez, Almasa, Colmena, Sigmasteel y Almapanel la adoptan igual o tienen la suya. Va en la sección 7 como decisión pendiente.</w:t>
+              <w:t xml:space="preserve">El documento está emitido por GYJ Ferreterías S.A. La dirección del programa confirmó el 14 de octubre que rige para las siete empresas. El Taller 1 la enseña como la regla de G&amp;J en todas.</w:t>
             </w:r>
           </w:p>
         </w:tc>
@@ -2615,7 +2615,7 @@
           <w:sz w:val="21"/>
           <w:szCs w:val="21"/>
         </w:rPr>
-        <w:t xml:space="preserve">El encuentro 1 ya pasó. Esto aplica al encuentro 2 del 16 de octubre, al kit del participante y a la evaluación.</w:t>
+        <w:t xml:space="preserve">Encuentro 1 el viernes 16 de octubre, consultorio el miércoles 21, encuentro 2 el viernes 23. Los ajustes entran en los dos encuentros, en el kit y en la evaluación.</w:t>
       </w:r>
     </w:p>
     <w:tbl>
@@ -2773,7 +2773,7 @@
                 <w:sz w:val="19"/>
                 <w:szCs w:val="19"/>
               </w:rPr>
-              <w:t xml:space="preserve">El caso del encuentro 2 es el de las 15 cotizaciones por WhatsApp. Cada persona arma su instrucción reutilizable sobre ese caso antes de pasar a una tarea propia.</w:t>
+              <w:t xml:space="preserve">El caso de clase es el de las 15 cotizaciones por WhatsApp: demostración en el encuentro 1 y primera instrucción reutilizable de cada persona en el encuentro 2, antes de pasar a una tarea propia.</w:t>
             </w:r>
           </w:p>
         </w:tc>
@@ -2804,7 +2804,7 @@
                 <w:sz w:val="19"/>
                 <w:szCs w:val="19"/>
               </w:rPr>
-              <w:t xml:space="preserve">Temario, bloque «Mi primera tarea con IA». Guía, «Encuentro 2 · aplicación».</w:t>
+              <w:t xml:space="preserve">Temario, bloques «Casos del rol comercial» y «Mi primera tarea con IA». Guía, demostración y «Encuentro 2 · aplicación».</w:t>
             </w:r>
           </w:p>
         </w:tc>
@@ -2871,7 +2871,7 @@
                 <w:sz w:val="19"/>
                 <w:szCs w:val="19"/>
               </w:rPr>
-              <w:t xml:space="preserve">El segundo caso del encuentro 2 es ordenar los 40 correos del lunes: extraer qué pide cada uno, quién y para cuándo, en una tabla.</w:t>
+              <w:t xml:space="preserve">El segundo caso de clase es ordenar los 40 correos del lunes: extraer qué pide cada uno, quién y para cuándo, en una tabla.</w:t>
             </w:r>
           </w:p>
         </w:tc>
@@ -2969,7 +2969,7 @@
                 <w:sz w:val="19"/>
                 <w:szCs w:val="19"/>
               </w:rPr>
-              <w:t xml:space="preserve">Apertura del encuentro 2 con la política: los cuatro contenidos que exige el numeral 10, en diez minutos, y la firma pendiente resuelta en el mismo espacio con Gestión Humana.</w:t>
+              <w:t xml:space="preserve">Apertura del encuentro 1 con la política: los cuatro contenidos que exige el numeral 10, en diez minutos, y la firma pendiente resuelta en el mismo espacio con Gestión Humana.</w:t>
             </w:r>
           </w:p>
         </w:tc>
@@ -5559,7 +5559,7 @@
           <w:sz w:val="21"/>
           <w:szCs w:val="21"/>
         </w:rPr>
-        <w:t xml:space="preserve">El encuentro 1 es hoy, 14 de octubre. Esto aplica al encuentro 2 del 21, al kit y a la evaluación.</w:t>
+        <w:t xml:space="preserve">Encuentro 1 el miércoles 21 de octubre, consultorio el viernes 23, encuentro 2 el miércoles 28. Los ajustes entran en los dos encuentros, en el kit y en la evaluación.</w:t>
       </w:r>
     </w:p>
     <w:tbl>
@@ -5717,7 +5717,7 @@
                 <w:sz w:val="19"/>
                 <w:szCs w:val="19"/>
               </w:rPr>
-              <w:t xml:space="preserve">El encuentro 2 abre por la estructura de comunicar: el resumen de cinco puntos se convierte en lo que se presenta en diez minutos: qué pasó, por qué, qué proponemos, qué necesitamos.</w:t>
+              <w:t xml:space="preserve">El taller abre por la estructura de comunicar: el resumen de cinco puntos de la demostración se convierte en lo que se presenta en diez minutos: qué pasó, por qué, qué proponemos, qué necesitamos. En el encuentro 2 cada persona lo hace con un documento suyo.</w:t>
             </w:r>
           </w:p>
         </w:tc>
@@ -5748,7 +5748,7 @@
                 <w:sz w:val="19"/>
                 <w:szCs w:val="19"/>
               </w:rPr>
-              <w:t xml:space="preserve">Temario, bloque «Mi primera tarea con IA». Guía, «Encuentro 2».</w:t>
+              <w:t xml:space="preserve">Temario, bloques «Casos del rol administrativo» y «Mi primera tarea con IA». Guía, demostración y «Encuentro 2».</w:t>
             </w:r>
           </w:p>
         </w:tc>
@@ -6011,7 +6011,7 @@
                 <w:sz w:val="19"/>
                 <w:szCs w:val="19"/>
               </w:rPr>
-              <w:t xml:space="preserve">Apertura del encuentro 2 con la política, los cuatro contenidos del numeral 10, y la firma pendiente resuelta con Gestión Humana.</w:t>
+              <w:t xml:space="preserve">Apertura del encuentro 1 con la política, los cuatro contenidos del numeral 10, y la firma pendiente resuelta con Gestión Humana.</w:t>
             </w:r>
           </w:p>
         </w:tc>
@@ -9176,7 +9176,7 @@
           <w:sz w:val="21"/>
           <w:szCs w:val="21"/>
         </w:rPr>
-        <w:t xml:space="preserve">Seis decisiones que condicionan los ajustes. Las tres primeras tienen fecha de esta semana.</w:t>
+        <w:t xml:space="preserve">Cinco decisiones que condicionan los ajustes. Las dos primeras tienen fecha de esta semana.</w:t>
       </w:r>
     </w:p>
     <w:tbl>
@@ -9369,7 +9369,7 @@
                 <w:sz w:val="19"/>
                 <w:szCs w:val="19"/>
               </w:rPr>
-              <w:t xml:space="preserve">Alcance de la política: las otras seis empresas la adoptan igual o tienen la suya.</w:t>
+              <w:t xml:space="preserve">Lista escrita de herramientas y cuentas autorizadas: qué herramienta, con qué cuenta, desde qué red. Si NotebookLM entra o no.</w:t>
             </w:r>
           </w:p>
         </w:tc>
@@ -9400,7 +9400,7 @@
                 <w:sz w:val="19"/>
                 <w:szCs w:val="19"/>
               </w:rPr>
-              <w:t xml:space="preserve">Carolina Rivera</w:t>
+              <w:t xml:space="preserve">TIC, con Gestión Humana</w:t>
             </w:r>
           </w:p>
         </w:tc>
@@ -9431,136 +9431,7 @@
                 <w:sz w:val="19"/>
                 <w:szCs w:val="19"/>
               </w:rPr>
-              <w:t xml:space="preserve">21 de octubre, encuentro 2 administrativo</w:t>
-            </w:r>
-          </w:p>
-        </w:tc>
-        <w:tc>
-          <w:tcPr>
-            <w:tcW w:type="pct" w:w="28%"/>
-            <w:tcBorders>
-              <w:top w:val="single" w:color="DEDED9" w:sz="6"/>
-              <w:left w:val="none" w:color="FFFFFF" w:sz="0"/>
-              <w:bottom w:val="single" w:color="DEDED9" w:sz="6"/>
-              <w:right w:val="none" w:color="FFFFFF" w:sz="0"/>
-            </w:tcBorders>
-            <w:tcMar>
-              <w:top w:type="dxa" w:w="80"/>
-              <w:left w:type="dxa" w:w="110"/>
-              <w:bottom w:type="dxa" w:w="80"/>
-              <w:right w:type="dxa" w:w="110"/>
-            </w:tcMar>
-          </w:tcPr>
-          <w:p>
-            <w:pPr>
-              <w:spacing w:after="40" w:line="260"/>
-            </w:pPr>
-            <w:r>
-              <w:rPr>
-                <w:rFonts w:ascii="Atkinson Hyperlegible Next" w:cs="Atkinson Hyperlegible Next" w:eastAsia="Atkinson Hyperlegible Next" w:hAnsi="Atkinson Hyperlegible Next"/>
-                <w:color w:val="0D0D0C"/>
-                <w:sz w:val="19"/>
-                <w:szCs w:val="19"/>
-              </w:rPr>
-              <w:t xml:space="preserve">El T1 enseña como regla de G&amp;J algo que solo rige en Ferreterías.</w:t>
-            </w:r>
-          </w:p>
-        </w:tc>
-      </w:tr>
-      <w:tr>
-        <w:trPr>
-          <w:cantSplit/>
-        </w:trPr>
-        <w:tc>
-          <w:tcPr>
-            <w:tcW w:type="pct" w:w="34%"/>
-            <w:tcBorders>
-              <w:top w:val="single" w:color="DEDED9" w:sz="6"/>
-              <w:left w:val="none" w:color="FFFFFF" w:sz="0"/>
-              <w:bottom w:val="single" w:color="DEDED9" w:sz="6"/>
-              <w:right w:val="none" w:color="FFFFFF" w:sz="0"/>
-            </w:tcBorders>
-            <w:tcMar>
-              <w:top w:type="dxa" w:w="80"/>
-              <w:left w:type="dxa" w:w="110"/>
-              <w:bottom w:type="dxa" w:w="80"/>
-              <w:right w:type="dxa" w:w="110"/>
-            </w:tcMar>
-          </w:tcPr>
-          <w:p>
-            <w:pPr>
-              <w:spacing w:after="40" w:line="260"/>
-            </w:pPr>
-            <w:r>
-              <w:rPr>
-                <w:rFonts w:ascii="Atkinson Hyperlegible Next" w:cs="Atkinson Hyperlegible Next" w:eastAsia="Atkinson Hyperlegible Next" w:hAnsi="Atkinson Hyperlegible Next"/>
-                <w:color w:val="0D0D0C"/>
-                <w:sz w:val="19"/>
-                <w:szCs w:val="19"/>
-              </w:rPr>
-              <w:t xml:space="preserve">Lista escrita de herramientas y cuentas autorizadas: qué herramienta, con qué cuenta, desde qué red. Si NotebookLM entra o no.</w:t>
-            </w:r>
-          </w:p>
-        </w:tc>
-        <w:tc>
-          <w:tcPr>
-            <w:tcW w:type="pct" w:w="18%"/>
-            <w:tcBorders>
-              <w:top w:val="single" w:color="DEDED9" w:sz="6"/>
-              <w:left w:val="none" w:color="FFFFFF" w:sz="0"/>
-              <w:bottom w:val="single" w:color="DEDED9" w:sz="6"/>
-              <w:right w:val="none" w:color="FFFFFF" w:sz="0"/>
-            </w:tcBorders>
-            <w:tcMar>
-              <w:top w:type="dxa" w:w="80"/>
-              <w:left w:type="dxa" w:w="110"/>
-              <w:bottom w:type="dxa" w:w="80"/>
-              <w:right w:type="dxa" w:w="110"/>
-            </w:tcMar>
-          </w:tcPr>
-          <w:p>
-            <w:pPr>
-              <w:spacing w:after="40" w:line="260"/>
-            </w:pPr>
-            <w:r>
-              <w:rPr>
-                <w:rFonts w:ascii="Atkinson Hyperlegible Next" w:cs="Atkinson Hyperlegible Next" w:eastAsia="Atkinson Hyperlegible Next" w:hAnsi="Atkinson Hyperlegible Next"/>
-                <w:color w:val="0D0D0C"/>
-                <w:sz w:val="19"/>
-                <w:szCs w:val="19"/>
-              </w:rPr>
-              <w:t xml:space="preserve">TIC, con Gestión Humana</w:t>
-            </w:r>
-          </w:p>
-        </w:tc>
-        <w:tc>
-          <w:tcPr>
-            <w:tcW w:type="pct" w:w="20%"/>
-            <w:tcBorders>
-              <w:top w:val="single" w:color="DEDED9" w:sz="6"/>
-              <w:left w:val="none" w:color="FFFFFF" w:sz="0"/>
-              <w:bottom w:val="single" w:color="DEDED9" w:sz="6"/>
-              <w:right w:val="none" w:color="FFFFFF" w:sz="0"/>
-            </w:tcBorders>
-            <w:tcMar>
-              <w:top w:type="dxa" w:w="80"/>
-              <w:left w:type="dxa" w:w="110"/>
-              <w:bottom w:type="dxa" w:w="80"/>
-              <w:right w:type="dxa" w:w="110"/>
-            </w:tcMar>
-          </w:tcPr>
-          <w:p>
-            <w:pPr>
-              <w:spacing w:after="40" w:line="260"/>
-            </w:pPr>
-            <w:r>
-              <w:rPr>
-                <w:rFonts w:ascii="Atkinson Hyperlegible Next" w:cs="Atkinson Hyperlegible Next" w:eastAsia="Atkinson Hyperlegible Next" w:hAnsi="Atkinson Hyperlegible Next"/>
-                <w:color w:val="0D0D0C"/>
-                <w:sz w:val="19"/>
-                <w:szCs w:val="19"/>
-              </w:rPr>
-              <w:t xml:space="preserve">16 de octubre, encuentro 2 comercial</w:t>
+              <w:t xml:space="preserve">16 de octubre, encuentro 1 comercial</w:t>
             </w:r>
           </w:p>
         </w:tc>
@@ -10362,7 +10233,7 @@
                 <w:sz w:val="19"/>
                 <w:szCs w:val="19"/>
               </w:rPr>
-              <w:t xml:space="preserve">T1 de los dos perfiles: demostración con el archivo del kit y el paso de anonimizar; evaluación con las preguntas 6 y 7 sobre la política. T2 a T5: «Lo que no puede faltar» con los puntos nuevos. Sección 6, estándares: regla de cuenta y de datos.</w:t>
+              <w:t xml:space="preserve">Fechas del T1: 16 y 23 de octubre comercial, 21 y 28 administrativo. T1 de los dos perfiles: demostración con el archivo del kit y el paso de anonimizar; evaluación con las preguntas 6 y 7 sobre la política. T2 a T5: «Lo que no puede faltar» con los puntos nuevos. Sección 6, estándares: regla de cuenta y de datos.</w:t>
             </w:r>
           </w:p>
         </w:tc>
@@ -10532,7 +10403,7 @@
                 <w:sz w:val="19"/>
                 <w:szCs w:val="19"/>
               </w:rPr>
-              <w:t xml:space="preserve">Cronograma · hoja Jueves de Superpoderes</w:t>
+              <w:t xml:space="preserve">Cronograma</w:t>
             </w:r>
           </w:p>
         </w:tc>
@@ -10563,7 +10434,7 @@
                 <w:sz w:val="19"/>
                 <w:szCs w:val="19"/>
               </w:rPr>
-              <w:t xml:space="preserve">Retos 5, 10, 17 y 22 con el texto nuevo.</w:t>
+              <w:t xml:space="preserve">La versión ajustada del 14 de octubre reemplaza a la de Drive; la anterior pasa a 09 como superada. En la hoja Jueves de Superpoderes, los retos 5, 10, 17 y 22 con el texto nuevo. En Decisiones y Roles, los retos terminan el 29 de abril y el rol instruccional lo asume la dirección.</w:t>
             </w:r>
           </w:p>
         </w:tc>

</xml_diff>

<commit_message>
Tablas con rejilla de columnas y anchos fijos para Word
Co-Authored-By: Claude Fable 5.1 <noreply@anthropic.com>
Claude-Session: https://claude.ai/code/session_01Ja1vbRoiAwxTq3mLFGrVau
</commit_message>
<xml_diff>
--- a/formacion/Ajustes a los talleres · diagnóstico y política de IA.docx
+++ b/formacion/Ajustes a los talleres · diagnóstico y política de IA.docx
@@ -92,7 +92,7 @@
     </w:p>
     <w:tbl>
       <w:tblPr>
-        <w:tblW w:type="pct" w:w="100%"/>
+        <w:tblW w:type="dxa" w:w="9972"/>
         <w:tblBorders>
           <w:top w:val="single" w:color="auto" w:sz="4"/>
           <w:left w:val="single" w:color="auto" w:sz="4"/>
@@ -101,13 +101,15 @@
           <w:insideH w:val="single" w:color="auto" w:sz="4"/>
           <w:insideV w:val="single" w:color="auto" w:sz="4"/>
         </w:tblBorders>
+        <w:tblLayout w:type="fixed"/>
       </w:tblPr>
       <w:tblGrid>
-        <w:gridCol w:w="100"/>
+        <w:gridCol w:w="9972"/>
       </w:tblGrid>
       <w:tr>
         <w:tc>
           <w:tcPr>
+            <w:tcW w:type="dxa" w:w="9972"/>
             <w:tcBorders>
               <w:top w:val="none" w:color="FFFFFF" w:sz="0"/>
               <w:left w:val="single" w:color="FCC800" w:sz="36"/>
@@ -230,7 +232,7 @@
     </w:p>
     <w:tbl>
       <w:tblPr>
-        <w:tblW w:type="pct" w:w="100%"/>
+        <w:tblW w:type="dxa" w:w="9972"/>
         <w:tblBorders>
           <w:top w:val="single" w:color="auto" w:sz="4"/>
           <w:left w:val="single" w:color="auto" w:sz="4"/>
@@ -239,11 +241,12 @@
           <w:insideH w:val="single" w:color="auto" w:sz="4"/>
           <w:insideV w:val="single" w:color="auto" w:sz="4"/>
         </w:tblBorders>
+        <w:tblLayout w:type="fixed"/>
       </w:tblPr>
       <w:tblGrid>
-        <w:gridCol w:w="100"/>
-        <w:gridCol w:w="100"/>
-        <w:gridCol w:w="100"/>
+        <w:gridCol w:w="2593"/>
+        <w:gridCol w:w="4388"/>
+        <w:gridCol w:w="2991"/>
       </w:tblGrid>
       <w:tr>
         <w:trPr>
@@ -251,7 +254,7 @@
         </w:trPr>
         <w:tc>
           <w:tcPr>
-            <w:tcW w:type="pct" w:w="26%"/>
+            <w:tcW w:type="dxa" w:w="2593"/>
             <w:tcBorders>
               <w:top w:val="single" w:color="DEDED9" w:sz="6"/>
               <w:left w:val="none" w:color="FFFFFF" w:sz="0"/>
@@ -285,7 +288,7 @@
         </w:tc>
         <w:tc>
           <w:tcPr>
-            <w:tcW w:type="pct" w:w="44%"/>
+            <w:tcW w:type="dxa" w:w="4388"/>
             <w:tcBorders>
               <w:top w:val="single" w:color="DEDED9" w:sz="6"/>
               <w:left w:val="none" w:color="FFFFFF" w:sz="0"/>
@@ -319,7 +322,7 @@
         </w:tc>
         <w:tc>
           <w:tcPr>
-            <w:tcW w:type="pct" w:w="30%"/>
+            <w:tcW w:type="dxa" w:w="2991"/>
             <w:tcBorders>
               <w:top w:val="single" w:color="DEDED9" w:sz="6"/>
               <w:left w:val="none" w:color="FFFFFF" w:sz="0"/>
@@ -358,7 +361,7 @@
         </w:trPr>
         <w:tc>
           <w:tcPr>
-            <w:tcW w:type="pct" w:w="26%"/>
+            <w:tcW w:type="dxa" w:w="2593"/>
             <w:tcBorders>
               <w:top w:val="single" w:color="DEDED9" w:sz="6"/>
               <w:left w:val="none" w:color="FFFFFF" w:sz="0"/>
@@ -389,7 +392,7 @@
         </w:tc>
         <w:tc>
           <w:tcPr>
-            <w:tcW w:type="pct" w:w="44%"/>
+            <w:tcW w:type="dxa" w:w="4388"/>
             <w:tcBorders>
               <w:top w:val="single" w:color="DEDED9" w:sz="6"/>
               <w:left w:val="none" w:color="FFFFFF" w:sz="0"/>
@@ -420,7 +423,7 @@
         </w:tc>
         <w:tc>
           <w:tcPr>
-            <w:tcW w:type="pct" w:w="30%"/>
+            <w:tcW w:type="dxa" w:w="2991"/>
             <w:tcBorders>
               <w:top w:val="single" w:color="DEDED9" w:sz="6"/>
               <w:left w:val="none" w:color="FFFFFF" w:sz="0"/>
@@ -456,7 +459,7 @@
         </w:trPr>
         <w:tc>
           <w:tcPr>
-            <w:tcW w:type="pct" w:w="26%"/>
+            <w:tcW w:type="dxa" w:w="2593"/>
             <w:tcBorders>
               <w:top w:val="single" w:color="DEDED9" w:sz="6"/>
               <w:left w:val="none" w:color="FFFFFF" w:sz="0"/>
@@ -487,7 +490,7 @@
         </w:tc>
         <w:tc>
           <w:tcPr>
-            <w:tcW w:type="pct" w:w="44%"/>
+            <w:tcW w:type="dxa" w:w="4388"/>
             <w:tcBorders>
               <w:top w:val="single" w:color="DEDED9" w:sz="6"/>
               <w:left w:val="none" w:color="FFFFFF" w:sz="0"/>
@@ -518,7 +521,7 @@
         </w:tc>
         <w:tc>
           <w:tcPr>
-            <w:tcW w:type="pct" w:w="30%"/>
+            <w:tcW w:type="dxa" w:w="2991"/>
             <w:tcBorders>
               <w:top w:val="single" w:color="DEDED9" w:sz="6"/>
               <w:left w:val="none" w:color="FFFFFF" w:sz="0"/>
@@ -554,7 +557,7 @@
         </w:trPr>
         <w:tc>
           <w:tcPr>
-            <w:tcW w:type="pct" w:w="26%"/>
+            <w:tcW w:type="dxa" w:w="2593"/>
             <w:tcBorders>
               <w:top w:val="single" w:color="DEDED9" w:sz="6"/>
               <w:left w:val="none" w:color="FFFFFF" w:sz="0"/>
@@ -585,7 +588,7 @@
         </w:tc>
         <w:tc>
           <w:tcPr>
-            <w:tcW w:type="pct" w:w="44%"/>
+            <w:tcW w:type="dxa" w:w="4388"/>
             <w:tcBorders>
               <w:top w:val="single" w:color="DEDED9" w:sz="6"/>
               <w:left w:val="none" w:color="FFFFFF" w:sz="0"/>
@@ -616,7 +619,7 @@
         </w:tc>
         <w:tc>
           <w:tcPr>
-            <w:tcW w:type="pct" w:w="30%"/>
+            <w:tcW w:type="dxa" w:w="2991"/>
             <w:tcBorders>
               <w:top w:val="single" w:color="DEDED9" w:sz="6"/>
               <w:left w:val="none" w:color="FFFFFF" w:sz="0"/>
@@ -652,7 +655,7 @@
         </w:trPr>
         <w:tc>
           <w:tcPr>
-            <w:tcW w:type="pct" w:w="26%"/>
+            <w:tcW w:type="dxa" w:w="2593"/>
             <w:tcBorders>
               <w:top w:val="single" w:color="DEDED9" w:sz="6"/>
               <w:left w:val="none" w:color="FFFFFF" w:sz="0"/>
@@ -683,7 +686,7 @@
         </w:tc>
         <w:tc>
           <w:tcPr>
-            <w:tcW w:type="pct" w:w="44%"/>
+            <w:tcW w:type="dxa" w:w="4388"/>
             <w:tcBorders>
               <w:top w:val="single" w:color="DEDED9" w:sz="6"/>
               <w:left w:val="none" w:color="FFFFFF" w:sz="0"/>
@@ -714,7 +717,7 @@
         </w:tc>
         <w:tc>
           <w:tcPr>
-            <w:tcW w:type="pct" w:w="30%"/>
+            <w:tcW w:type="dxa" w:w="2991"/>
             <w:tcBorders>
               <w:top w:val="single" w:color="DEDED9" w:sz="6"/>
               <w:left w:val="none" w:color="FFFFFF" w:sz="0"/>
@@ -750,7 +753,7 @@
         </w:trPr>
         <w:tc>
           <w:tcPr>
-            <w:tcW w:type="pct" w:w="26%"/>
+            <w:tcW w:type="dxa" w:w="2593"/>
             <w:tcBorders>
               <w:top w:val="single" w:color="DEDED9" w:sz="6"/>
               <w:left w:val="none" w:color="FFFFFF" w:sz="0"/>
@@ -781,7 +784,7 @@
         </w:tc>
         <w:tc>
           <w:tcPr>
-            <w:tcW w:type="pct" w:w="44%"/>
+            <w:tcW w:type="dxa" w:w="4388"/>
             <w:tcBorders>
               <w:top w:val="single" w:color="DEDED9" w:sz="6"/>
               <w:left w:val="none" w:color="FFFFFF" w:sz="0"/>
@@ -812,7 +815,7 @@
         </w:tc>
         <w:tc>
           <w:tcPr>
-            <w:tcW w:type="pct" w:w="30%"/>
+            <w:tcW w:type="dxa" w:w="2991"/>
             <w:tcBorders>
               <w:top w:val="single" w:color="DEDED9" w:sz="6"/>
               <w:left w:val="none" w:color="FFFFFF" w:sz="0"/>
@@ -848,7 +851,7 @@
         </w:trPr>
         <w:tc>
           <w:tcPr>
-            <w:tcW w:type="pct" w:w="26%"/>
+            <w:tcW w:type="dxa" w:w="2593"/>
             <w:tcBorders>
               <w:top w:val="single" w:color="DEDED9" w:sz="6"/>
               <w:left w:val="none" w:color="FFFFFF" w:sz="0"/>
@@ -879,7 +882,7 @@
         </w:tc>
         <w:tc>
           <w:tcPr>
-            <w:tcW w:type="pct" w:w="44%"/>
+            <w:tcW w:type="dxa" w:w="4388"/>
             <w:tcBorders>
               <w:top w:val="single" w:color="DEDED9" w:sz="6"/>
               <w:left w:val="none" w:color="FFFFFF" w:sz="0"/>
@@ -910,7 +913,7 @@
         </w:tc>
         <w:tc>
           <w:tcPr>
-            <w:tcW w:type="pct" w:w="30%"/>
+            <w:tcW w:type="dxa" w:w="2991"/>
             <w:tcBorders>
               <w:top w:val="single" w:color="DEDED9" w:sz="6"/>
               <w:left w:val="none" w:color="FFFFFF" w:sz="0"/>
@@ -946,7 +949,7 @@
         </w:trPr>
         <w:tc>
           <w:tcPr>
-            <w:tcW w:type="pct" w:w="26%"/>
+            <w:tcW w:type="dxa" w:w="2593"/>
             <w:tcBorders>
               <w:top w:val="single" w:color="DEDED9" w:sz="6"/>
               <w:left w:val="none" w:color="FFFFFF" w:sz="0"/>
@@ -977,7 +980,7 @@
         </w:tc>
         <w:tc>
           <w:tcPr>
-            <w:tcW w:type="pct" w:w="44%"/>
+            <w:tcW w:type="dxa" w:w="4388"/>
             <w:tcBorders>
               <w:top w:val="single" w:color="DEDED9" w:sz="6"/>
               <w:left w:val="none" w:color="FFFFFF" w:sz="0"/>
@@ -1008,7 +1011,7 @@
         </w:tc>
         <w:tc>
           <w:tcPr>
-            <w:tcW w:type="pct" w:w="30%"/>
+            <w:tcW w:type="dxa" w:w="2991"/>
             <w:tcBorders>
               <w:top w:val="single" w:color="DEDED9" w:sz="6"/>
               <w:left w:val="none" w:color="FFFFFF" w:sz="0"/>
@@ -1044,7 +1047,7 @@
         </w:trPr>
         <w:tc>
           <w:tcPr>
-            <w:tcW w:type="pct" w:w="26%"/>
+            <w:tcW w:type="dxa" w:w="2593"/>
             <w:tcBorders>
               <w:top w:val="single" w:color="DEDED9" w:sz="6"/>
               <w:left w:val="none" w:color="FFFFFF" w:sz="0"/>
@@ -1075,7 +1078,7 @@
         </w:tc>
         <w:tc>
           <w:tcPr>
-            <w:tcW w:type="pct" w:w="44%"/>
+            <w:tcW w:type="dxa" w:w="4388"/>
             <w:tcBorders>
               <w:top w:val="single" w:color="DEDED9" w:sz="6"/>
               <w:left w:val="none" w:color="FFFFFF" w:sz="0"/>
@@ -1106,7 +1109,7 @@
         </w:tc>
         <w:tc>
           <w:tcPr>
-            <w:tcW w:type="pct" w:w="30%"/>
+            <w:tcW w:type="dxa" w:w="2991"/>
             <w:tcBorders>
               <w:top w:val="single" w:color="DEDED9" w:sz="6"/>
               <w:left w:val="none" w:color="FFFFFF" w:sz="0"/>
@@ -1142,7 +1145,7 @@
         </w:trPr>
         <w:tc>
           <w:tcPr>
-            <w:tcW w:type="pct" w:w="26%"/>
+            <w:tcW w:type="dxa" w:w="2593"/>
             <w:tcBorders>
               <w:top w:val="single" w:color="DEDED9" w:sz="6"/>
               <w:left w:val="none" w:color="FFFFFF" w:sz="0"/>
@@ -1173,7 +1176,7 @@
         </w:tc>
         <w:tc>
           <w:tcPr>
-            <w:tcW w:type="pct" w:w="44%"/>
+            <w:tcW w:type="dxa" w:w="4388"/>
             <w:tcBorders>
               <w:top w:val="single" w:color="DEDED9" w:sz="6"/>
               <w:left w:val="none" w:color="FFFFFF" w:sz="0"/>
@@ -1204,7 +1207,7 @@
         </w:tc>
         <w:tc>
           <w:tcPr>
-            <w:tcW w:type="pct" w:w="30%"/>
+            <w:tcW w:type="dxa" w:w="2991"/>
             <w:tcBorders>
               <w:top w:val="single" w:color="DEDED9" w:sz="6"/>
               <w:left w:val="none" w:color="FFFFFF" w:sz="0"/>
@@ -1323,7 +1326,7 @@
     </w:p>
     <w:tbl>
       <w:tblPr>
-        <w:tblW w:type="pct" w:w="100%"/>
+        <w:tblW w:type="dxa" w:w="9972"/>
         <w:tblBorders>
           <w:top w:val="single" w:color="auto" w:sz="4"/>
           <w:left w:val="single" w:color="auto" w:sz="4"/>
@@ -1332,11 +1335,12 @@
           <w:insideH w:val="single" w:color="auto" w:sz="4"/>
           <w:insideV w:val="single" w:color="auto" w:sz="4"/>
         </w:tblBorders>
+        <w:tblLayout w:type="fixed"/>
       </w:tblPr>
       <w:tblGrid>
-        <w:gridCol w:w="100"/>
-        <w:gridCol w:w="100"/>
-        <w:gridCol w:w="100"/>
+        <w:gridCol w:w="3291"/>
+        <w:gridCol w:w="3291"/>
+        <w:gridCol w:w="3390"/>
       </w:tblGrid>
       <w:tr>
         <w:trPr>
@@ -1344,7 +1348,7 @@
         </w:trPr>
         <w:tc>
           <w:tcPr>
-            <w:tcW w:type="pct" w:w="33%"/>
+            <w:tcW w:type="dxa" w:w="3291"/>
             <w:tcBorders>
               <w:top w:val="single" w:color="DEDED9" w:sz="6"/>
               <w:left w:val="none" w:color="FFFFFF" w:sz="0"/>
@@ -1378,7 +1382,7 @@
         </w:tc>
         <w:tc>
           <w:tcPr>
-            <w:tcW w:type="pct" w:w="33%"/>
+            <w:tcW w:type="dxa" w:w="3291"/>
             <w:tcBorders>
               <w:top w:val="single" w:color="DEDED9" w:sz="6"/>
               <w:left w:val="none" w:color="FFFFFF" w:sz="0"/>
@@ -1412,7 +1416,7 @@
         </w:tc>
         <w:tc>
           <w:tcPr>
-            <w:tcW w:type="pct" w:w="34%"/>
+            <w:tcW w:type="dxa" w:w="3390"/>
             <w:tcBorders>
               <w:top w:val="single" w:color="DEDED9" w:sz="6"/>
               <w:left w:val="none" w:color="FFFFFF" w:sz="0"/>
@@ -1451,7 +1455,7 @@
         </w:trPr>
         <w:tc>
           <w:tcPr>
-            <w:tcW w:type="pct" w:w="33%"/>
+            <w:tcW w:type="dxa" w:w="3291"/>
             <w:tcBorders>
               <w:top w:val="single" w:color="DEDED9" w:sz="6"/>
               <w:left w:val="none" w:color="FFFFFF" w:sz="0"/>
@@ -1482,7 +1486,7 @@
         </w:tc>
         <w:tc>
           <w:tcPr>
-            <w:tcW w:type="pct" w:w="33%"/>
+            <w:tcW w:type="dxa" w:w="3291"/>
             <w:tcBorders>
               <w:top w:val="single" w:color="DEDED9" w:sz="6"/>
               <w:left w:val="none" w:color="FFFFFF" w:sz="0"/>
@@ -1513,7 +1517,7 @@
         </w:tc>
         <w:tc>
           <w:tcPr>
-            <w:tcW w:type="pct" w:w="34%"/>
+            <w:tcW w:type="dxa" w:w="3390"/>
             <w:tcBorders>
               <w:top w:val="single" w:color="DEDED9" w:sz="6"/>
               <w:left w:val="none" w:color="FFFFFF" w:sz="0"/>
@@ -1549,7 +1553,7 @@
         </w:trPr>
         <w:tc>
           <w:tcPr>
-            <w:tcW w:type="pct" w:w="33%"/>
+            <w:tcW w:type="dxa" w:w="3291"/>
             <w:tcBorders>
               <w:top w:val="single" w:color="DEDED9" w:sz="6"/>
               <w:left w:val="none" w:color="FFFFFF" w:sz="0"/>
@@ -1580,7 +1584,7 @@
         </w:tc>
         <w:tc>
           <w:tcPr>
-            <w:tcW w:type="pct" w:w="33%"/>
+            <w:tcW w:type="dxa" w:w="3291"/>
             <w:tcBorders>
               <w:top w:val="single" w:color="DEDED9" w:sz="6"/>
               <w:left w:val="none" w:color="FFFFFF" w:sz="0"/>
@@ -1611,7 +1615,7 @@
         </w:tc>
         <w:tc>
           <w:tcPr>
-            <w:tcW w:type="pct" w:w="34%"/>
+            <w:tcW w:type="dxa" w:w="3390"/>
             <w:tcBorders>
               <w:top w:val="single" w:color="DEDED9" w:sz="6"/>
               <w:left w:val="none" w:color="FFFFFF" w:sz="0"/>
@@ -1647,7 +1651,7 @@
         </w:trPr>
         <w:tc>
           <w:tcPr>
-            <w:tcW w:type="pct" w:w="33%"/>
+            <w:tcW w:type="dxa" w:w="3291"/>
             <w:tcBorders>
               <w:top w:val="single" w:color="DEDED9" w:sz="6"/>
               <w:left w:val="none" w:color="FFFFFF" w:sz="0"/>
@@ -1678,7 +1682,7 @@
         </w:tc>
         <w:tc>
           <w:tcPr>
-            <w:tcW w:type="pct" w:w="33%"/>
+            <w:tcW w:type="dxa" w:w="3291"/>
             <w:tcBorders>
               <w:top w:val="single" w:color="DEDED9" w:sz="6"/>
               <w:left w:val="none" w:color="FFFFFF" w:sz="0"/>
@@ -1709,7 +1713,7 @@
         </w:tc>
         <w:tc>
           <w:tcPr>
-            <w:tcW w:type="pct" w:w="34%"/>
+            <w:tcW w:type="dxa" w:w="3390"/>
             <w:tcBorders>
               <w:top w:val="single" w:color="DEDED9" w:sz="6"/>
               <w:left w:val="none" w:color="FFFFFF" w:sz="0"/>
@@ -1745,7 +1749,7 @@
         </w:trPr>
         <w:tc>
           <w:tcPr>
-            <w:tcW w:type="pct" w:w="33%"/>
+            <w:tcW w:type="dxa" w:w="3291"/>
             <w:tcBorders>
               <w:top w:val="single" w:color="DEDED9" w:sz="6"/>
               <w:left w:val="none" w:color="FFFFFF" w:sz="0"/>
@@ -1776,7 +1780,7 @@
         </w:tc>
         <w:tc>
           <w:tcPr>
-            <w:tcW w:type="pct" w:w="33%"/>
+            <w:tcW w:type="dxa" w:w="3291"/>
             <w:tcBorders>
               <w:top w:val="single" w:color="DEDED9" w:sz="6"/>
               <w:left w:val="none" w:color="FFFFFF" w:sz="0"/>
@@ -1807,7 +1811,7 @@
         </w:tc>
         <w:tc>
           <w:tcPr>
-            <w:tcW w:type="pct" w:w="34%"/>
+            <w:tcW w:type="dxa" w:w="3390"/>
             <w:tcBorders>
               <w:top w:val="single" w:color="DEDED9" w:sz="6"/>
               <w:left w:val="none" w:color="FFFFFF" w:sz="0"/>
@@ -1843,7 +1847,7 @@
         </w:trPr>
         <w:tc>
           <w:tcPr>
-            <w:tcW w:type="pct" w:w="33%"/>
+            <w:tcW w:type="dxa" w:w="3291"/>
             <w:tcBorders>
               <w:top w:val="single" w:color="DEDED9" w:sz="6"/>
               <w:left w:val="none" w:color="FFFFFF" w:sz="0"/>
@@ -1874,7 +1878,7 @@
         </w:tc>
         <w:tc>
           <w:tcPr>
-            <w:tcW w:type="pct" w:w="33%"/>
+            <w:tcW w:type="dxa" w:w="3291"/>
             <w:tcBorders>
               <w:top w:val="single" w:color="DEDED9" w:sz="6"/>
               <w:left w:val="none" w:color="FFFFFF" w:sz="0"/>
@@ -1905,7 +1909,7 @@
         </w:tc>
         <w:tc>
           <w:tcPr>
-            <w:tcW w:type="pct" w:w="34%"/>
+            <w:tcW w:type="dxa" w:w="3390"/>
             <w:tcBorders>
               <w:top w:val="single" w:color="DEDED9" w:sz="6"/>
               <w:left w:val="none" w:color="FFFFFF" w:sz="0"/>
@@ -1941,7 +1945,7 @@
         </w:trPr>
         <w:tc>
           <w:tcPr>
-            <w:tcW w:type="pct" w:w="33%"/>
+            <w:tcW w:type="dxa" w:w="3291"/>
             <w:tcBorders>
               <w:top w:val="single" w:color="DEDED9" w:sz="6"/>
               <w:left w:val="none" w:color="FFFFFF" w:sz="0"/>
@@ -1972,7 +1976,7 @@
         </w:tc>
         <w:tc>
           <w:tcPr>
-            <w:tcW w:type="pct" w:w="33%"/>
+            <w:tcW w:type="dxa" w:w="3291"/>
             <w:tcBorders>
               <w:top w:val="single" w:color="DEDED9" w:sz="6"/>
               <w:left w:val="none" w:color="FFFFFF" w:sz="0"/>
@@ -2003,7 +2007,7 @@
         </w:tc>
         <w:tc>
           <w:tcPr>
-            <w:tcW w:type="pct" w:w="34%"/>
+            <w:tcW w:type="dxa" w:w="3390"/>
             <w:tcBorders>
               <w:top w:val="single" w:color="DEDED9" w:sz="6"/>
               <w:left w:val="none" w:color="FFFFFF" w:sz="0"/>
@@ -2041,7 +2045,7 @@
     </w:p>
     <w:tbl>
       <w:tblPr>
-        <w:tblW w:type="pct" w:w="100%"/>
+        <w:tblW w:type="dxa" w:w="9972"/>
         <w:tblBorders>
           <w:top w:val="single" w:color="auto" w:sz="4"/>
           <w:left w:val="single" w:color="auto" w:sz="4"/>
@@ -2050,13 +2054,15 @@
           <w:insideH w:val="single" w:color="auto" w:sz="4"/>
           <w:insideV w:val="single" w:color="auto" w:sz="4"/>
         </w:tblBorders>
+        <w:tblLayout w:type="fixed"/>
       </w:tblPr>
       <w:tblGrid>
-        <w:gridCol w:w="100"/>
+        <w:gridCol w:w="9972"/>
       </w:tblGrid>
       <w:tr>
         <w:tc>
           <w:tcPr>
+            <w:tcW w:type="dxa" w:w="9972"/>
             <w:tcBorders>
               <w:top w:val="none" w:color="FFFFFF" w:sz="0"/>
               <w:left w:val="single" w:color="FCC800" w:sz="36"/>
@@ -2166,7 +2172,7 @@
     </w:p>
     <w:tbl>
       <w:tblPr>
-        <w:tblW w:type="pct" w:w="100%"/>
+        <w:tblW w:type="dxa" w:w="9972"/>
         <w:tblBorders>
           <w:top w:val="single" w:color="auto" w:sz="4"/>
           <w:left w:val="single" w:color="auto" w:sz="4"/>
@@ -2175,13 +2181,15 @@
           <w:insideH w:val="single" w:color="auto" w:sz="4"/>
           <w:insideV w:val="single" w:color="auto" w:sz="4"/>
         </w:tblBorders>
+        <w:tblLayout w:type="fixed"/>
       </w:tblPr>
       <w:tblGrid>
-        <w:gridCol w:w="100"/>
+        <w:gridCol w:w="9972"/>
       </w:tblGrid>
       <w:tr>
         <w:tc>
           <w:tcPr>
+            <w:tcW w:type="dxa" w:w="9972"/>
             <w:tcBorders>
               <w:top w:val="none" w:color="FFFFFF" w:sz="0"/>
               <w:left w:val="single" w:color="FCC800" w:sz="36"/>
@@ -2620,7 +2628,7 @@
     </w:p>
     <w:tbl>
       <w:tblPr>
-        <w:tblW w:type="pct" w:w="100%"/>
+        <w:tblW w:type="dxa" w:w="9972"/>
         <w:tblBorders>
           <w:top w:val="single" w:color="auto" w:sz="4"/>
           <w:left w:val="single" w:color="auto" w:sz="4"/>
@@ -2629,11 +2637,12 @@
           <w:insideH w:val="single" w:color="auto" w:sz="4"/>
           <w:insideV w:val="single" w:color="auto" w:sz="4"/>
         </w:tblBorders>
+        <w:tblLayout w:type="fixed"/>
       </w:tblPr>
       <w:tblGrid>
-        <w:gridCol w:w="100"/>
-        <w:gridCol w:w="100"/>
-        <w:gridCol w:w="100"/>
+        <w:gridCol w:w="4188"/>
+        <w:gridCol w:w="2593"/>
+        <w:gridCol w:w="3191"/>
       </w:tblGrid>
       <w:tr>
         <w:trPr>
@@ -2641,7 +2650,7 @@
         </w:trPr>
         <w:tc>
           <w:tcPr>
-            <w:tcW w:type="pct" w:w="42%"/>
+            <w:tcW w:type="dxa" w:w="4188"/>
             <w:tcBorders>
               <w:top w:val="single" w:color="DEDED9" w:sz="6"/>
               <w:left w:val="none" w:color="FFFFFF" w:sz="0"/>
@@ -2675,7 +2684,7 @@
         </w:tc>
         <w:tc>
           <w:tcPr>
-            <w:tcW w:type="pct" w:w="26%"/>
+            <w:tcW w:type="dxa" w:w="2593"/>
             <w:tcBorders>
               <w:top w:val="single" w:color="DEDED9" w:sz="6"/>
               <w:left w:val="none" w:color="FFFFFF" w:sz="0"/>
@@ -2709,7 +2718,7 @@
         </w:tc>
         <w:tc>
           <w:tcPr>
-            <w:tcW w:type="pct" w:w="32%"/>
+            <w:tcW w:type="dxa" w:w="3191"/>
             <w:tcBorders>
               <w:top w:val="single" w:color="DEDED9" w:sz="6"/>
               <w:left w:val="none" w:color="FFFFFF" w:sz="0"/>
@@ -2748,7 +2757,7 @@
         </w:trPr>
         <w:tc>
           <w:tcPr>
-            <w:tcW w:type="pct" w:w="42%"/>
+            <w:tcW w:type="dxa" w:w="4188"/>
             <w:tcBorders>
               <w:top w:val="single" w:color="DEDED9" w:sz="6"/>
               <w:left w:val="none" w:color="FFFFFF" w:sz="0"/>
@@ -2779,7 +2788,7 @@
         </w:tc>
         <w:tc>
           <w:tcPr>
-            <w:tcW w:type="pct" w:w="26%"/>
+            <w:tcW w:type="dxa" w:w="2593"/>
             <w:tcBorders>
               <w:top w:val="single" w:color="DEDED9" w:sz="6"/>
               <w:left w:val="none" w:color="FFFFFF" w:sz="0"/>
@@ -2810,7 +2819,7 @@
         </w:tc>
         <w:tc>
           <w:tcPr>
-            <w:tcW w:type="pct" w:w="32%"/>
+            <w:tcW w:type="dxa" w:w="3191"/>
             <w:tcBorders>
               <w:top w:val="single" w:color="DEDED9" w:sz="6"/>
               <w:left w:val="none" w:color="FFFFFF" w:sz="0"/>
@@ -2846,7 +2855,7 @@
         </w:trPr>
         <w:tc>
           <w:tcPr>
-            <w:tcW w:type="pct" w:w="42%"/>
+            <w:tcW w:type="dxa" w:w="4188"/>
             <w:tcBorders>
               <w:top w:val="single" w:color="DEDED9" w:sz="6"/>
               <w:left w:val="none" w:color="FFFFFF" w:sz="0"/>
@@ -2877,7 +2886,7 @@
         </w:tc>
         <w:tc>
           <w:tcPr>
-            <w:tcW w:type="pct" w:w="26%"/>
+            <w:tcW w:type="dxa" w:w="2593"/>
             <w:tcBorders>
               <w:top w:val="single" w:color="DEDED9" w:sz="6"/>
               <w:left w:val="none" w:color="FFFFFF" w:sz="0"/>
@@ -2908,7 +2917,7 @@
         </w:tc>
         <w:tc>
           <w:tcPr>
-            <w:tcW w:type="pct" w:w="32%"/>
+            <w:tcW w:type="dxa" w:w="3191"/>
             <w:tcBorders>
               <w:top w:val="single" w:color="DEDED9" w:sz="6"/>
               <w:left w:val="none" w:color="FFFFFF" w:sz="0"/>
@@ -2944,7 +2953,7 @@
         </w:trPr>
         <w:tc>
           <w:tcPr>
-            <w:tcW w:type="pct" w:w="42%"/>
+            <w:tcW w:type="dxa" w:w="4188"/>
             <w:tcBorders>
               <w:top w:val="single" w:color="DEDED9" w:sz="6"/>
               <w:left w:val="none" w:color="FFFFFF" w:sz="0"/>
@@ -2975,7 +2984,7 @@
         </w:tc>
         <w:tc>
           <w:tcPr>
-            <w:tcW w:type="pct" w:w="26%"/>
+            <w:tcW w:type="dxa" w:w="2593"/>
             <w:tcBorders>
               <w:top w:val="single" w:color="DEDED9" w:sz="6"/>
               <w:left w:val="none" w:color="FFFFFF" w:sz="0"/>
@@ -3006,7 +3015,7 @@
         </w:tc>
         <w:tc>
           <w:tcPr>
-            <w:tcW w:type="pct" w:w="32%"/>
+            <w:tcW w:type="dxa" w:w="3191"/>
             <w:tcBorders>
               <w:top w:val="single" w:color="DEDED9" w:sz="6"/>
               <w:left w:val="none" w:color="FFFFFF" w:sz="0"/>
@@ -3042,7 +3051,7 @@
         </w:trPr>
         <w:tc>
           <w:tcPr>
-            <w:tcW w:type="pct" w:w="42%"/>
+            <w:tcW w:type="dxa" w:w="4188"/>
             <w:tcBorders>
               <w:top w:val="single" w:color="DEDED9" w:sz="6"/>
               <w:left w:val="none" w:color="FFFFFF" w:sz="0"/>
@@ -3073,7 +3082,7 @@
         </w:tc>
         <w:tc>
           <w:tcPr>
-            <w:tcW w:type="pct" w:w="26%"/>
+            <w:tcW w:type="dxa" w:w="2593"/>
             <w:tcBorders>
               <w:top w:val="single" w:color="DEDED9" w:sz="6"/>
               <w:left w:val="none" w:color="FFFFFF" w:sz="0"/>
@@ -3104,7 +3113,7 @@
         </w:tc>
         <w:tc>
           <w:tcPr>
-            <w:tcW w:type="pct" w:w="32%"/>
+            <w:tcW w:type="dxa" w:w="3191"/>
             <w:tcBorders>
               <w:top w:val="single" w:color="DEDED9" w:sz="6"/>
               <w:left w:val="none" w:color="FFFFFF" w:sz="0"/>
@@ -3140,7 +3149,7 @@
         </w:trPr>
         <w:tc>
           <w:tcPr>
-            <w:tcW w:type="pct" w:w="42%"/>
+            <w:tcW w:type="dxa" w:w="4188"/>
             <w:tcBorders>
               <w:top w:val="single" w:color="DEDED9" w:sz="6"/>
               <w:left w:val="none" w:color="FFFFFF" w:sz="0"/>
@@ -3171,7 +3180,7 @@
         </w:tc>
         <w:tc>
           <w:tcPr>
-            <w:tcW w:type="pct" w:w="26%"/>
+            <w:tcW w:type="dxa" w:w="2593"/>
             <w:tcBorders>
               <w:top w:val="single" w:color="DEDED9" w:sz="6"/>
               <w:left w:val="none" w:color="FFFFFF" w:sz="0"/>
@@ -3202,7 +3211,7 @@
         </w:tc>
         <w:tc>
           <w:tcPr>
-            <w:tcW w:type="pct" w:w="32%"/>
+            <w:tcW w:type="dxa" w:w="3191"/>
             <w:tcBorders>
               <w:top w:val="single" w:color="DEDED9" w:sz="6"/>
               <w:left w:val="none" w:color="FFFFFF" w:sz="0"/>
@@ -3238,7 +3247,7 @@
         </w:trPr>
         <w:tc>
           <w:tcPr>
-            <w:tcW w:type="pct" w:w="42%"/>
+            <w:tcW w:type="dxa" w:w="4188"/>
             <w:tcBorders>
               <w:top w:val="single" w:color="DEDED9" w:sz="6"/>
               <w:left w:val="none" w:color="FFFFFF" w:sz="0"/>
@@ -3269,7 +3278,7 @@
         </w:tc>
         <w:tc>
           <w:tcPr>
-            <w:tcW w:type="pct" w:w="26%"/>
+            <w:tcW w:type="dxa" w:w="2593"/>
             <w:tcBorders>
               <w:top w:val="single" w:color="DEDED9" w:sz="6"/>
               <w:left w:val="none" w:color="FFFFFF" w:sz="0"/>
@@ -3300,7 +3309,7 @@
         </w:tc>
         <w:tc>
           <w:tcPr>
-            <w:tcW w:type="pct" w:w="32%"/>
+            <w:tcW w:type="dxa" w:w="3191"/>
             <w:tcBorders>
               <w:top w:val="single" w:color="DEDED9" w:sz="6"/>
               <w:left w:val="none" w:color="FFFFFF" w:sz="0"/>
@@ -3350,7 +3359,7 @@
     </w:p>
     <w:tbl>
       <w:tblPr>
-        <w:tblW w:type="pct" w:w="100%"/>
+        <w:tblW w:type="dxa" w:w="9972"/>
         <w:tblBorders>
           <w:top w:val="single" w:color="auto" w:sz="4"/>
           <w:left w:val="single" w:color="auto" w:sz="4"/>
@@ -3359,11 +3368,12 @@
           <w:insideH w:val="single" w:color="auto" w:sz="4"/>
           <w:insideV w:val="single" w:color="auto" w:sz="4"/>
         </w:tblBorders>
+        <w:tblLayout w:type="fixed"/>
       </w:tblPr>
       <w:tblGrid>
-        <w:gridCol w:w="100"/>
-        <w:gridCol w:w="100"/>
-        <w:gridCol w:w="100"/>
+        <w:gridCol w:w="4188"/>
+        <w:gridCol w:w="2593"/>
+        <w:gridCol w:w="3191"/>
       </w:tblGrid>
       <w:tr>
         <w:trPr>
@@ -3371,7 +3381,7 @@
         </w:trPr>
         <w:tc>
           <w:tcPr>
-            <w:tcW w:type="pct" w:w="42%"/>
+            <w:tcW w:type="dxa" w:w="4188"/>
             <w:tcBorders>
               <w:top w:val="single" w:color="DEDED9" w:sz="6"/>
               <w:left w:val="none" w:color="FFFFFF" w:sz="0"/>
@@ -3405,7 +3415,7 @@
         </w:tc>
         <w:tc>
           <w:tcPr>
-            <w:tcW w:type="pct" w:w="26%"/>
+            <w:tcW w:type="dxa" w:w="2593"/>
             <w:tcBorders>
               <w:top w:val="single" w:color="DEDED9" w:sz="6"/>
               <w:left w:val="none" w:color="FFFFFF" w:sz="0"/>
@@ -3439,7 +3449,7 @@
         </w:tc>
         <w:tc>
           <w:tcPr>
-            <w:tcW w:type="pct" w:w="32%"/>
+            <w:tcW w:type="dxa" w:w="3191"/>
             <w:tcBorders>
               <w:top w:val="single" w:color="DEDED9" w:sz="6"/>
               <w:left w:val="none" w:color="FFFFFF" w:sz="0"/>
@@ -3478,7 +3488,7 @@
         </w:trPr>
         <w:tc>
           <w:tcPr>
-            <w:tcW w:type="pct" w:w="42%"/>
+            <w:tcW w:type="dxa" w:w="4188"/>
             <w:tcBorders>
               <w:top w:val="single" w:color="DEDED9" w:sz="6"/>
               <w:left w:val="none" w:color="FFFFFF" w:sz="0"/>
@@ -3509,7 +3519,7 @@
         </w:tc>
         <w:tc>
           <w:tcPr>
-            <w:tcW w:type="pct" w:w="26%"/>
+            <w:tcW w:type="dxa" w:w="2593"/>
             <w:tcBorders>
               <w:top w:val="single" w:color="DEDED9" w:sz="6"/>
               <w:left w:val="none" w:color="FFFFFF" w:sz="0"/>
@@ -3540,7 +3550,7 @@
         </w:tc>
         <w:tc>
           <w:tcPr>
-            <w:tcW w:type="pct" w:w="32%"/>
+            <w:tcW w:type="dxa" w:w="3191"/>
             <w:tcBorders>
               <w:top w:val="single" w:color="DEDED9" w:sz="6"/>
               <w:left w:val="none" w:color="FFFFFF" w:sz="0"/>
@@ -3576,7 +3586,7 @@
         </w:trPr>
         <w:tc>
           <w:tcPr>
-            <w:tcW w:type="pct" w:w="42%"/>
+            <w:tcW w:type="dxa" w:w="4188"/>
             <w:tcBorders>
               <w:top w:val="single" w:color="DEDED9" w:sz="6"/>
               <w:left w:val="none" w:color="FFFFFF" w:sz="0"/>
@@ -3607,7 +3617,7 @@
         </w:tc>
         <w:tc>
           <w:tcPr>
-            <w:tcW w:type="pct" w:w="26%"/>
+            <w:tcW w:type="dxa" w:w="2593"/>
             <w:tcBorders>
               <w:top w:val="single" w:color="DEDED9" w:sz="6"/>
               <w:left w:val="none" w:color="FFFFFF" w:sz="0"/>
@@ -3638,7 +3648,7 @@
         </w:tc>
         <w:tc>
           <w:tcPr>
-            <w:tcW w:type="pct" w:w="32%"/>
+            <w:tcW w:type="dxa" w:w="3191"/>
             <w:tcBorders>
               <w:top w:val="single" w:color="DEDED9" w:sz="6"/>
               <w:left w:val="none" w:color="FFFFFF" w:sz="0"/>
@@ -3674,7 +3684,7 @@
         </w:trPr>
         <w:tc>
           <w:tcPr>
-            <w:tcW w:type="pct" w:w="42%"/>
+            <w:tcW w:type="dxa" w:w="4188"/>
             <w:tcBorders>
               <w:top w:val="single" w:color="DEDED9" w:sz="6"/>
               <w:left w:val="none" w:color="FFFFFF" w:sz="0"/>
@@ -3705,7 +3715,7 @@
         </w:tc>
         <w:tc>
           <w:tcPr>
-            <w:tcW w:type="pct" w:w="26%"/>
+            <w:tcW w:type="dxa" w:w="2593"/>
             <w:tcBorders>
               <w:top w:val="single" w:color="DEDED9" w:sz="6"/>
               <w:left w:val="none" w:color="FFFFFF" w:sz="0"/>
@@ -3736,7 +3746,7 @@
         </w:tc>
         <w:tc>
           <w:tcPr>
-            <w:tcW w:type="pct" w:w="32%"/>
+            <w:tcW w:type="dxa" w:w="3191"/>
             <w:tcBorders>
               <w:top w:val="single" w:color="DEDED9" w:sz="6"/>
               <w:left w:val="none" w:color="FFFFFF" w:sz="0"/>
@@ -3786,7 +3796,7 @@
     </w:p>
     <w:tbl>
       <w:tblPr>
-        <w:tblW w:type="pct" w:w="100%"/>
+        <w:tblW w:type="dxa" w:w="9972"/>
         <w:tblBorders>
           <w:top w:val="single" w:color="auto" w:sz="4"/>
           <w:left w:val="single" w:color="auto" w:sz="4"/>
@@ -3795,11 +3805,12 @@
           <w:insideH w:val="single" w:color="auto" w:sz="4"/>
           <w:insideV w:val="single" w:color="auto" w:sz="4"/>
         </w:tblBorders>
+        <w:tblLayout w:type="fixed"/>
       </w:tblPr>
       <w:tblGrid>
-        <w:gridCol w:w="100"/>
-        <w:gridCol w:w="100"/>
-        <w:gridCol w:w="100"/>
+        <w:gridCol w:w="4188"/>
+        <w:gridCol w:w="2593"/>
+        <w:gridCol w:w="3191"/>
       </w:tblGrid>
       <w:tr>
         <w:trPr>
@@ -3807,7 +3818,7 @@
         </w:trPr>
         <w:tc>
           <w:tcPr>
-            <w:tcW w:type="pct" w:w="42%"/>
+            <w:tcW w:type="dxa" w:w="4188"/>
             <w:tcBorders>
               <w:top w:val="single" w:color="DEDED9" w:sz="6"/>
               <w:left w:val="none" w:color="FFFFFF" w:sz="0"/>
@@ -3841,7 +3852,7 @@
         </w:tc>
         <w:tc>
           <w:tcPr>
-            <w:tcW w:type="pct" w:w="26%"/>
+            <w:tcW w:type="dxa" w:w="2593"/>
             <w:tcBorders>
               <w:top w:val="single" w:color="DEDED9" w:sz="6"/>
               <w:left w:val="none" w:color="FFFFFF" w:sz="0"/>
@@ -3875,7 +3886,7 @@
         </w:tc>
         <w:tc>
           <w:tcPr>
-            <w:tcW w:type="pct" w:w="32%"/>
+            <w:tcW w:type="dxa" w:w="3191"/>
             <w:tcBorders>
               <w:top w:val="single" w:color="DEDED9" w:sz="6"/>
               <w:left w:val="none" w:color="FFFFFF" w:sz="0"/>
@@ -3914,7 +3925,7 @@
         </w:trPr>
         <w:tc>
           <w:tcPr>
-            <w:tcW w:type="pct" w:w="42%"/>
+            <w:tcW w:type="dxa" w:w="4188"/>
             <w:tcBorders>
               <w:top w:val="single" w:color="DEDED9" w:sz="6"/>
               <w:left w:val="none" w:color="FFFFFF" w:sz="0"/>
@@ -3945,7 +3956,7 @@
         </w:tc>
         <w:tc>
           <w:tcPr>
-            <w:tcW w:type="pct" w:w="26%"/>
+            <w:tcW w:type="dxa" w:w="2593"/>
             <w:tcBorders>
               <w:top w:val="single" w:color="DEDED9" w:sz="6"/>
               <w:left w:val="none" w:color="FFFFFF" w:sz="0"/>
@@ -3976,7 +3987,7 @@
         </w:tc>
         <w:tc>
           <w:tcPr>
-            <w:tcW w:type="pct" w:w="32%"/>
+            <w:tcW w:type="dxa" w:w="3191"/>
             <w:tcBorders>
               <w:top w:val="single" w:color="DEDED9" w:sz="6"/>
               <w:left w:val="none" w:color="FFFFFF" w:sz="0"/>
@@ -4012,7 +4023,7 @@
         </w:trPr>
         <w:tc>
           <w:tcPr>
-            <w:tcW w:type="pct" w:w="42%"/>
+            <w:tcW w:type="dxa" w:w="4188"/>
             <w:tcBorders>
               <w:top w:val="single" w:color="DEDED9" w:sz="6"/>
               <w:left w:val="none" w:color="FFFFFF" w:sz="0"/>
@@ -4043,7 +4054,7 @@
         </w:tc>
         <w:tc>
           <w:tcPr>
-            <w:tcW w:type="pct" w:w="26%"/>
+            <w:tcW w:type="dxa" w:w="2593"/>
             <w:tcBorders>
               <w:top w:val="single" w:color="DEDED9" w:sz="6"/>
               <w:left w:val="none" w:color="FFFFFF" w:sz="0"/>
@@ -4074,7 +4085,7 @@
         </w:tc>
         <w:tc>
           <w:tcPr>
-            <w:tcW w:type="pct" w:w="32%"/>
+            <w:tcW w:type="dxa" w:w="3191"/>
             <w:tcBorders>
               <w:top w:val="single" w:color="DEDED9" w:sz="6"/>
               <w:left w:val="none" w:color="FFFFFF" w:sz="0"/>
@@ -4110,7 +4121,7 @@
         </w:trPr>
         <w:tc>
           <w:tcPr>
-            <w:tcW w:type="pct" w:w="42%"/>
+            <w:tcW w:type="dxa" w:w="4188"/>
             <w:tcBorders>
               <w:top w:val="single" w:color="DEDED9" w:sz="6"/>
               <w:left w:val="none" w:color="FFFFFF" w:sz="0"/>
@@ -4141,7 +4152,7 @@
         </w:tc>
         <w:tc>
           <w:tcPr>
-            <w:tcW w:type="pct" w:w="26%"/>
+            <w:tcW w:type="dxa" w:w="2593"/>
             <w:tcBorders>
               <w:top w:val="single" w:color="DEDED9" w:sz="6"/>
               <w:left w:val="none" w:color="FFFFFF" w:sz="0"/>
@@ -4172,7 +4183,7 @@
         </w:tc>
         <w:tc>
           <w:tcPr>
-            <w:tcW w:type="pct" w:w="32%"/>
+            <w:tcW w:type="dxa" w:w="3191"/>
             <w:tcBorders>
               <w:top w:val="single" w:color="DEDED9" w:sz="6"/>
               <w:left w:val="none" w:color="FFFFFF" w:sz="0"/>
@@ -4208,7 +4219,7 @@
         </w:trPr>
         <w:tc>
           <w:tcPr>
-            <w:tcW w:type="pct" w:w="42%"/>
+            <w:tcW w:type="dxa" w:w="4188"/>
             <w:tcBorders>
               <w:top w:val="single" w:color="DEDED9" w:sz="6"/>
               <w:left w:val="none" w:color="FFFFFF" w:sz="0"/>
@@ -4239,7 +4250,7 @@
         </w:tc>
         <w:tc>
           <w:tcPr>
-            <w:tcW w:type="pct" w:w="26%"/>
+            <w:tcW w:type="dxa" w:w="2593"/>
             <w:tcBorders>
               <w:top w:val="single" w:color="DEDED9" w:sz="6"/>
               <w:left w:val="none" w:color="FFFFFF" w:sz="0"/>
@@ -4270,7 +4281,7 @@
         </w:tc>
         <w:tc>
           <w:tcPr>
-            <w:tcW w:type="pct" w:w="32%"/>
+            <w:tcW w:type="dxa" w:w="3191"/>
             <w:tcBorders>
               <w:top w:val="single" w:color="DEDED9" w:sz="6"/>
               <w:left w:val="none" w:color="FFFFFF" w:sz="0"/>
@@ -4320,7 +4331,7 @@
     </w:p>
     <w:tbl>
       <w:tblPr>
-        <w:tblW w:type="pct" w:w="100%"/>
+        <w:tblW w:type="dxa" w:w="9972"/>
         <w:tblBorders>
           <w:top w:val="single" w:color="auto" w:sz="4"/>
           <w:left w:val="single" w:color="auto" w:sz="4"/>
@@ -4329,11 +4340,12 @@
           <w:insideH w:val="single" w:color="auto" w:sz="4"/>
           <w:insideV w:val="single" w:color="auto" w:sz="4"/>
         </w:tblBorders>
+        <w:tblLayout w:type="fixed"/>
       </w:tblPr>
       <w:tblGrid>
-        <w:gridCol w:w="100"/>
-        <w:gridCol w:w="100"/>
-        <w:gridCol w:w="100"/>
+        <w:gridCol w:w="4188"/>
+        <w:gridCol w:w="2593"/>
+        <w:gridCol w:w="3191"/>
       </w:tblGrid>
       <w:tr>
         <w:trPr>
@@ -4341,7 +4353,7 @@
         </w:trPr>
         <w:tc>
           <w:tcPr>
-            <w:tcW w:type="pct" w:w="42%"/>
+            <w:tcW w:type="dxa" w:w="4188"/>
             <w:tcBorders>
               <w:top w:val="single" w:color="DEDED9" w:sz="6"/>
               <w:left w:val="none" w:color="FFFFFF" w:sz="0"/>
@@ -4375,7 +4387,7 @@
         </w:tc>
         <w:tc>
           <w:tcPr>
-            <w:tcW w:type="pct" w:w="26%"/>
+            <w:tcW w:type="dxa" w:w="2593"/>
             <w:tcBorders>
               <w:top w:val="single" w:color="DEDED9" w:sz="6"/>
               <w:left w:val="none" w:color="FFFFFF" w:sz="0"/>
@@ -4409,7 +4421,7 @@
         </w:tc>
         <w:tc>
           <w:tcPr>
-            <w:tcW w:type="pct" w:w="32%"/>
+            <w:tcW w:type="dxa" w:w="3191"/>
             <w:tcBorders>
               <w:top w:val="single" w:color="DEDED9" w:sz="6"/>
               <w:left w:val="none" w:color="FFFFFF" w:sz="0"/>
@@ -4448,7 +4460,7 @@
         </w:trPr>
         <w:tc>
           <w:tcPr>
-            <w:tcW w:type="pct" w:w="42%"/>
+            <w:tcW w:type="dxa" w:w="4188"/>
             <w:tcBorders>
               <w:top w:val="single" w:color="DEDED9" w:sz="6"/>
               <w:left w:val="none" w:color="FFFFFF" w:sz="0"/>
@@ -4479,7 +4491,7 @@
         </w:tc>
         <w:tc>
           <w:tcPr>
-            <w:tcW w:type="pct" w:w="26%"/>
+            <w:tcW w:type="dxa" w:w="2593"/>
             <w:tcBorders>
               <w:top w:val="single" w:color="DEDED9" w:sz="6"/>
               <w:left w:val="none" w:color="FFFFFF" w:sz="0"/>
@@ -4510,7 +4522,7 @@
         </w:tc>
         <w:tc>
           <w:tcPr>
-            <w:tcW w:type="pct" w:w="32%"/>
+            <w:tcW w:type="dxa" w:w="3191"/>
             <w:tcBorders>
               <w:top w:val="single" w:color="DEDED9" w:sz="6"/>
               <w:left w:val="none" w:color="FFFFFF" w:sz="0"/>
@@ -4546,7 +4558,7 @@
         </w:trPr>
         <w:tc>
           <w:tcPr>
-            <w:tcW w:type="pct" w:w="42%"/>
+            <w:tcW w:type="dxa" w:w="4188"/>
             <w:tcBorders>
               <w:top w:val="single" w:color="DEDED9" w:sz="6"/>
               <w:left w:val="none" w:color="FFFFFF" w:sz="0"/>
@@ -4577,7 +4589,7 @@
         </w:tc>
         <w:tc>
           <w:tcPr>
-            <w:tcW w:type="pct" w:w="26%"/>
+            <w:tcW w:type="dxa" w:w="2593"/>
             <w:tcBorders>
               <w:top w:val="single" w:color="DEDED9" w:sz="6"/>
               <w:left w:val="none" w:color="FFFFFF" w:sz="0"/>
@@ -4608,7 +4620,7 @@
         </w:tc>
         <w:tc>
           <w:tcPr>
-            <w:tcW w:type="pct" w:w="32%"/>
+            <w:tcW w:type="dxa" w:w="3191"/>
             <w:tcBorders>
               <w:top w:val="single" w:color="DEDED9" w:sz="6"/>
               <w:left w:val="none" w:color="FFFFFF" w:sz="0"/>
@@ -4644,7 +4656,7 @@
         </w:trPr>
         <w:tc>
           <w:tcPr>
-            <w:tcW w:type="pct" w:w="42%"/>
+            <w:tcW w:type="dxa" w:w="4188"/>
             <w:tcBorders>
               <w:top w:val="single" w:color="DEDED9" w:sz="6"/>
               <w:left w:val="none" w:color="FFFFFF" w:sz="0"/>
@@ -4675,7 +4687,7 @@
         </w:tc>
         <w:tc>
           <w:tcPr>
-            <w:tcW w:type="pct" w:w="26%"/>
+            <w:tcW w:type="dxa" w:w="2593"/>
             <w:tcBorders>
               <w:top w:val="single" w:color="DEDED9" w:sz="6"/>
               <w:left w:val="none" w:color="FFFFFF" w:sz="0"/>
@@ -4706,7 +4718,7 @@
         </w:tc>
         <w:tc>
           <w:tcPr>
-            <w:tcW w:type="pct" w:w="32%"/>
+            <w:tcW w:type="dxa" w:w="3191"/>
             <w:tcBorders>
               <w:top w:val="single" w:color="DEDED9" w:sz="6"/>
               <w:left w:val="none" w:color="FFFFFF" w:sz="0"/>
@@ -4756,7 +4768,7 @@
     </w:p>
     <w:tbl>
       <w:tblPr>
-        <w:tblW w:type="pct" w:w="100%"/>
+        <w:tblW w:type="dxa" w:w="9972"/>
         <w:tblBorders>
           <w:top w:val="single" w:color="auto" w:sz="4"/>
           <w:left w:val="single" w:color="auto" w:sz="4"/>
@@ -4765,11 +4777,12 @@
           <w:insideH w:val="single" w:color="auto" w:sz="4"/>
           <w:insideV w:val="single" w:color="auto" w:sz="4"/>
         </w:tblBorders>
+        <w:tblLayout w:type="fixed"/>
       </w:tblPr>
       <w:tblGrid>
-        <w:gridCol w:w="100"/>
-        <w:gridCol w:w="100"/>
-        <w:gridCol w:w="100"/>
+        <w:gridCol w:w="4188"/>
+        <w:gridCol w:w="2593"/>
+        <w:gridCol w:w="3191"/>
       </w:tblGrid>
       <w:tr>
         <w:trPr>
@@ -4777,7 +4790,7 @@
         </w:trPr>
         <w:tc>
           <w:tcPr>
-            <w:tcW w:type="pct" w:w="42%"/>
+            <w:tcW w:type="dxa" w:w="4188"/>
             <w:tcBorders>
               <w:top w:val="single" w:color="DEDED9" w:sz="6"/>
               <w:left w:val="none" w:color="FFFFFF" w:sz="0"/>
@@ -4811,7 +4824,7 @@
         </w:tc>
         <w:tc>
           <w:tcPr>
-            <w:tcW w:type="pct" w:w="26%"/>
+            <w:tcW w:type="dxa" w:w="2593"/>
             <w:tcBorders>
               <w:top w:val="single" w:color="DEDED9" w:sz="6"/>
               <w:left w:val="none" w:color="FFFFFF" w:sz="0"/>
@@ -4845,7 +4858,7 @@
         </w:tc>
         <w:tc>
           <w:tcPr>
-            <w:tcW w:type="pct" w:w="32%"/>
+            <w:tcW w:type="dxa" w:w="3191"/>
             <w:tcBorders>
               <w:top w:val="single" w:color="DEDED9" w:sz="6"/>
               <w:left w:val="none" w:color="FFFFFF" w:sz="0"/>
@@ -4884,7 +4897,7 @@
         </w:trPr>
         <w:tc>
           <w:tcPr>
-            <w:tcW w:type="pct" w:w="42%"/>
+            <w:tcW w:type="dxa" w:w="4188"/>
             <w:tcBorders>
               <w:top w:val="single" w:color="DEDED9" w:sz="6"/>
               <w:left w:val="none" w:color="FFFFFF" w:sz="0"/>
@@ -4915,7 +4928,7 @@
         </w:tc>
         <w:tc>
           <w:tcPr>
-            <w:tcW w:type="pct" w:w="26%"/>
+            <w:tcW w:type="dxa" w:w="2593"/>
             <w:tcBorders>
               <w:top w:val="single" w:color="DEDED9" w:sz="6"/>
               <w:left w:val="none" w:color="FFFFFF" w:sz="0"/>
@@ -4946,7 +4959,7 @@
         </w:tc>
         <w:tc>
           <w:tcPr>
-            <w:tcW w:type="pct" w:w="32%"/>
+            <w:tcW w:type="dxa" w:w="3191"/>
             <w:tcBorders>
               <w:top w:val="single" w:color="DEDED9" w:sz="6"/>
               <w:left w:val="none" w:color="FFFFFF" w:sz="0"/>
@@ -4982,7 +4995,7 @@
         </w:trPr>
         <w:tc>
           <w:tcPr>
-            <w:tcW w:type="pct" w:w="42%"/>
+            <w:tcW w:type="dxa" w:w="4188"/>
             <w:tcBorders>
               <w:top w:val="single" w:color="DEDED9" w:sz="6"/>
               <w:left w:val="none" w:color="FFFFFF" w:sz="0"/>
@@ -5013,7 +5026,7 @@
         </w:tc>
         <w:tc>
           <w:tcPr>
-            <w:tcW w:type="pct" w:w="26%"/>
+            <w:tcW w:type="dxa" w:w="2593"/>
             <w:tcBorders>
               <w:top w:val="single" w:color="DEDED9" w:sz="6"/>
               <w:left w:val="none" w:color="FFFFFF" w:sz="0"/>
@@ -5044,7 +5057,7 @@
         </w:tc>
         <w:tc>
           <w:tcPr>
-            <w:tcW w:type="pct" w:w="32%"/>
+            <w:tcW w:type="dxa" w:w="3191"/>
             <w:tcBorders>
               <w:top w:val="single" w:color="DEDED9" w:sz="6"/>
               <w:left w:val="none" w:color="FFFFFF" w:sz="0"/>
@@ -5080,7 +5093,7 @@
         </w:trPr>
         <w:tc>
           <w:tcPr>
-            <w:tcW w:type="pct" w:w="42%"/>
+            <w:tcW w:type="dxa" w:w="4188"/>
             <w:tcBorders>
               <w:top w:val="single" w:color="DEDED9" w:sz="6"/>
               <w:left w:val="none" w:color="FFFFFF" w:sz="0"/>
@@ -5111,7 +5124,7 @@
         </w:tc>
         <w:tc>
           <w:tcPr>
-            <w:tcW w:type="pct" w:w="26%"/>
+            <w:tcW w:type="dxa" w:w="2593"/>
             <w:tcBorders>
               <w:top w:val="single" w:color="DEDED9" w:sz="6"/>
               <w:left w:val="none" w:color="FFFFFF" w:sz="0"/>
@@ -5142,7 +5155,7 @@
         </w:tc>
         <w:tc>
           <w:tcPr>
-            <w:tcW w:type="pct" w:w="32%"/>
+            <w:tcW w:type="dxa" w:w="3191"/>
             <w:tcBorders>
               <w:top w:val="single" w:color="DEDED9" w:sz="6"/>
               <w:left w:val="none" w:color="FFFFFF" w:sz="0"/>
@@ -5192,7 +5205,7 @@
     </w:p>
     <w:tbl>
       <w:tblPr>
-        <w:tblW w:type="pct" w:w="100%"/>
+        <w:tblW w:type="dxa" w:w="9972"/>
         <w:tblBorders>
           <w:top w:val="single" w:color="auto" w:sz="4"/>
           <w:left w:val="single" w:color="auto" w:sz="4"/>
@@ -5201,11 +5214,12 @@
           <w:insideH w:val="single" w:color="auto" w:sz="4"/>
           <w:insideV w:val="single" w:color="auto" w:sz="4"/>
         </w:tblBorders>
+        <w:tblLayout w:type="fixed"/>
       </w:tblPr>
       <w:tblGrid>
-        <w:gridCol w:w="100"/>
-        <w:gridCol w:w="100"/>
-        <w:gridCol w:w="100"/>
+        <w:gridCol w:w="4188"/>
+        <w:gridCol w:w="2593"/>
+        <w:gridCol w:w="3191"/>
       </w:tblGrid>
       <w:tr>
         <w:trPr>
@@ -5213,7 +5227,7 @@
         </w:trPr>
         <w:tc>
           <w:tcPr>
-            <w:tcW w:type="pct" w:w="42%"/>
+            <w:tcW w:type="dxa" w:w="4188"/>
             <w:tcBorders>
               <w:top w:val="single" w:color="DEDED9" w:sz="6"/>
               <w:left w:val="none" w:color="FFFFFF" w:sz="0"/>
@@ -5247,7 +5261,7 @@
         </w:tc>
         <w:tc>
           <w:tcPr>
-            <w:tcW w:type="pct" w:w="26%"/>
+            <w:tcW w:type="dxa" w:w="2593"/>
             <w:tcBorders>
               <w:top w:val="single" w:color="DEDED9" w:sz="6"/>
               <w:left w:val="none" w:color="FFFFFF" w:sz="0"/>
@@ -5281,7 +5295,7 @@
         </w:tc>
         <w:tc>
           <w:tcPr>
-            <w:tcW w:type="pct" w:w="32%"/>
+            <w:tcW w:type="dxa" w:w="3191"/>
             <w:tcBorders>
               <w:top w:val="single" w:color="DEDED9" w:sz="6"/>
               <w:left w:val="none" w:color="FFFFFF" w:sz="0"/>
@@ -5320,7 +5334,7 @@
         </w:trPr>
         <w:tc>
           <w:tcPr>
-            <w:tcW w:type="pct" w:w="42%"/>
+            <w:tcW w:type="dxa" w:w="4188"/>
             <w:tcBorders>
               <w:top w:val="single" w:color="DEDED9" w:sz="6"/>
               <w:left w:val="none" w:color="FFFFFF" w:sz="0"/>
@@ -5351,7 +5365,7 @@
         </w:tc>
         <w:tc>
           <w:tcPr>
-            <w:tcW w:type="pct" w:w="26%"/>
+            <w:tcW w:type="dxa" w:w="2593"/>
             <w:tcBorders>
               <w:top w:val="single" w:color="DEDED9" w:sz="6"/>
               <w:left w:val="none" w:color="FFFFFF" w:sz="0"/>
@@ -5382,7 +5396,7 @@
         </w:tc>
         <w:tc>
           <w:tcPr>
-            <w:tcW w:type="pct" w:w="32%"/>
+            <w:tcW w:type="dxa" w:w="3191"/>
             <w:tcBorders>
               <w:top w:val="single" w:color="DEDED9" w:sz="6"/>
               <w:left w:val="none" w:color="FFFFFF" w:sz="0"/>
@@ -5418,7 +5432,7 @@
         </w:trPr>
         <w:tc>
           <w:tcPr>
-            <w:tcW w:type="pct" w:w="42%"/>
+            <w:tcW w:type="dxa" w:w="4188"/>
             <w:tcBorders>
               <w:top w:val="single" w:color="DEDED9" w:sz="6"/>
               <w:left w:val="none" w:color="FFFFFF" w:sz="0"/>
@@ -5449,7 +5463,7 @@
         </w:tc>
         <w:tc>
           <w:tcPr>
-            <w:tcW w:type="pct" w:w="26%"/>
+            <w:tcW w:type="dxa" w:w="2593"/>
             <w:tcBorders>
               <w:top w:val="single" w:color="DEDED9" w:sz="6"/>
               <w:left w:val="none" w:color="FFFFFF" w:sz="0"/>
@@ -5480,7 +5494,7 @@
         </w:tc>
         <w:tc>
           <w:tcPr>
-            <w:tcW w:type="pct" w:w="32%"/>
+            <w:tcW w:type="dxa" w:w="3191"/>
             <w:tcBorders>
               <w:top w:val="single" w:color="DEDED9" w:sz="6"/>
               <w:left w:val="none" w:color="FFFFFF" w:sz="0"/>
@@ -5564,7 +5578,7 @@
     </w:p>
     <w:tbl>
       <w:tblPr>
-        <w:tblW w:type="pct" w:w="100%"/>
+        <w:tblW w:type="dxa" w:w="9972"/>
         <w:tblBorders>
           <w:top w:val="single" w:color="auto" w:sz="4"/>
           <w:left w:val="single" w:color="auto" w:sz="4"/>
@@ -5573,11 +5587,12 @@
           <w:insideH w:val="single" w:color="auto" w:sz="4"/>
           <w:insideV w:val="single" w:color="auto" w:sz="4"/>
         </w:tblBorders>
+        <w:tblLayout w:type="fixed"/>
       </w:tblPr>
       <w:tblGrid>
-        <w:gridCol w:w="100"/>
-        <w:gridCol w:w="100"/>
-        <w:gridCol w:w="100"/>
+        <w:gridCol w:w="4188"/>
+        <w:gridCol w:w="2593"/>
+        <w:gridCol w:w="3191"/>
       </w:tblGrid>
       <w:tr>
         <w:trPr>
@@ -5585,7 +5600,7 @@
         </w:trPr>
         <w:tc>
           <w:tcPr>
-            <w:tcW w:type="pct" w:w="42%"/>
+            <w:tcW w:type="dxa" w:w="4188"/>
             <w:tcBorders>
               <w:top w:val="single" w:color="DEDED9" w:sz="6"/>
               <w:left w:val="none" w:color="FFFFFF" w:sz="0"/>
@@ -5619,7 +5634,7 @@
         </w:tc>
         <w:tc>
           <w:tcPr>
-            <w:tcW w:type="pct" w:w="26%"/>
+            <w:tcW w:type="dxa" w:w="2593"/>
             <w:tcBorders>
               <w:top w:val="single" w:color="DEDED9" w:sz="6"/>
               <w:left w:val="none" w:color="FFFFFF" w:sz="0"/>
@@ -5653,7 +5668,7 @@
         </w:tc>
         <w:tc>
           <w:tcPr>
-            <w:tcW w:type="pct" w:w="32%"/>
+            <w:tcW w:type="dxa" w:w="3191"/>
             <w:tcBorders>
               <w:top w:val="single" w:color="DEDED9" w:sz="6"/>
               <w:left w:val="none" w:color="FFFFFF" w:sz="0"/>
@@ -5692,7 +5707,7 @@
         </w:trPr>
         <w:tc>
           <w:tcPr>
-            <w:tcW w:type="pct" w:w="42%"/>
+            <w:tcW w:type="dxa" w:w="4188"/>
             <w:tcBorders>
               <w:top w:val="single" w:color="DEDED9" w:sz="6"/>
               <w:left w:val="none" w:color="FFFFFF" w:sz="0"/>
@@ -5723,7 +5738,7 @@
         </w:tc>
         <w:tc>
           <w:tcPr>
-            <w:tcW w:type="pct" w:w="26%"/>
+            <w:tcW w:type="dxa" w:w="2593"/>
             <w:tcBorders>
               <w:top w:val="single" w:color="DEDED9" w:sz="6"/>
               <w:left w:val="none" w:color="FFFFFF" w:sz="0"/>
@@ -5754,7 +5769,7 @@
         </w:tc>
         <w:tc>
           <w:tcPr>
-            <w:tcW w:type="pct" w:w="32%"/>
+            <w:tcW w:type="dxa" w:w="3191"/>
             <w:tcBorders>
               <w:top w:val="single" w:color="DEDED9" w:sz="6"/>
               <w:left w:val="none" w:color="FFFFFF" w:sz="0"/>
@@ -5790,7 +5805,7 @@
         </w:trPr>
         <w:tc>
           <w:tcPr>
-            <w:tcW w:type="pct" w:w="42%"/>
+            <w:tcW w:type="dxa" w:w="4188"/>
             <w:tcBorders>
               <w:top w:val="single" w:color="DEDED9" w:sz="6"/>
               <w:left w:val="none" w:color="FFFFFF" w:sz="0"/>
@@ -5821,7 +5836,7 @@
         </w:tc>
         <w:tc>
           <w:tcPr>
-            <w:tcW w:type="pct" w:w="26%"/>
+            <w:tcW w:type="dxa" w:w="2593"/>
             <w:tcBorders>
               <w:top w:val="single" w:color="DEDED9" w:sz="6"/>
               <w:left w:val="none" w:color="FFFFFF" w:sz="0"/>
@@ -5852,7 +5867,7 @@
         </w:tc>
         <w:tc>
           <w:tcPr>
-            <w:tcW w:type="pct" w:w="32%"/>
+            <w:tcW w:type="dxa" w:w="3191"/>
             <w:tcBorders>
               <w:top w:val="single" w:color="DEDED9" w:sz="6"/>
               <w:left w:val="none" w:color="FFFFFF" w:sz="0"/>
@@ -5888,7 +5903,7 @@
         </w:trPr>
         <w:tc>
           <w:tcPr>
-            <w:tcW w:type="pct" w:w="42%"/>
+            <w:tcW w:type="dxa" w:w="4188"/>
             <w:tcBorders>
               <w:top w:val="single" w:color="DEDED9" w:sz="6"/>
               <w:left w:val="none" w:color="FFFFFF" w:sz="0"/>
@@ -5919,7 +5934,7 @@
         </w:tc>
         <w:tc>
           <w:tcPr>
-            <w:tcW w:type="pct" w:w="26%"/>
+            <w:tcW w:type="dxa" w:w="2593"/>
             <w:tcBorders>
               <w:top w:val="single" w:color="DEDED9" w:sz="6"/>
               <w:left w:val="none" w:color="FFFFFF" w:sz="0"/>
@@ -5950,7 +5965,7 @@
         </w:tc>
         <w:tc>
           <w:tcPr>
-            <w:tcW w:type="pct" w:w="32%"/>
+            <w:tcW w:type="dxa" w:w="3191"/>
             <w:tcBorders>
               <w:top w:val="single" w:color="DEDED9" w:sz="6"/>
               <w:left w:val="none" w:color="FFFFFF" w:sz="0"/>
@@ -5986,7 +6001,7 @@
         </w:trPr>
         <w:tc>
           <w:tcPr>
-            <w:tcW w:type="pct" w:w="42%"/>
+            <w:tcW w:type="dxa" w:w="4188"/>
             <w:tcBorders>
               <w:top w:val="single" w:color="DEDED9" w:sz="6"/>
               <w:left w:val="none" w:color="FFFFFF" w:sz="0"/>
@@ -6017,7 +6032,7 @@
         </w:tc>
         <w:tc>
           <w:tcPr>
-            <w:tcW w:type="pct" w:w="26%"/>
+            <w:tcW w:type="dxa" w:w="2593"/>
             <w:tcBorders>
               <w:top w:val="single" w:color="DEDED9" w:sz="6"/>
               <w:left w:val="none" w:color="FFFFFF" w:sz="0"/>
@@ -6048,7 +6063,7 @@
         </w:tc>
         <w:tc>
           <w:tcPr>
-            <w:tcW w:type="pct" w:w="32%"/>
+            <w:tcW w:type="dxa" w:w="3191"/>
             <w:tcBorders>
               <w:top w:val="single" w:color="DEDED9" w:sz="6"/>
               <w:left w:val="none" w:color="FFFFFF" w:sz="0"/>
@@ -6084,7 +6099,7 @@
         </w:trPr>
         <w:tc>
           <w:tcPr>
-            <w:tcW w:type="pct" w:w="42%"/>
+            <w:tcW w:type="dxa" w:w="4188"/>
             <w:tcBorders>
               <w:top w:val="single" w:color="DEDED9" w:sz="6"/>
               <w:left w:val="none" w:color="FFFFFF" w:sz="0"/>
@@ -6115,7 +6130,7 @@
         </w:tc>
         <w:tc>
           <w:tcPr>
-            <w:tcW w:type="pct" w:w="26%"/>
+            <w:tcW w:type="dxa" w:w="2593"/>
             <w:tcBorders>
               <w:top w:val="single" w:color="DEDED9" w:sz="6"/>
               <w:left w:val="none" w:color="FFFFFF" w:sz="0"/>
@@ -6146,7 +6161,7 @@
         </w:tc>
         <w:tc>
           <w:tcPr>
-            <w:tcW w:type="pct" w:w="32%"/>
+            <w:tcW w:type="dxa" w:w="3191"/>
             <w:tcBorders>
               <w:top w:val="single" w:color="DEDED9" w:sz="6"/>
               <w:left w:val="none" w:color="FFFFFF" w:sz="0"/>
@@ -6196,7 +6211,7 @@
     </w:p>
     <w:tbl>
       <w:tblPr>
-        <w:tblW w:type="pct" w:w="100%"/>
+        <w:tblW w:type="dxa" w:w="9972"/>
         <w:tblBorders>
           <w:top w:val="single" w:color="auto" w:sz="4"/>
           <w:left w:val="single" w:color="auto" w:sz="4"/>
@@ -6205,11 +6220,12 @@
           <w:insideH w:val="single" w:color="auto" w:sz="4"/>
           <w:insideV w:val="single" w:color="auto" w:sz="4"/>
         </w:tblBorders>
+        <w:tblLayout w:type="fixed"/>
       </w:tblPr>
       <w:tblGrid>
-        <w:gridCol w:w="100"/>
-        <w:gridCol w:w="100"/>
-        <w:gridCol w:w="100"/>
+        <w:gridCol w:w="4188"/>
+        <w:gridCol w:w="2593"/>
+        <w:gridCol w:w="3191"/>
       </w:tblGrid>
       <w:tr>
         <w:trPr>
@@ -6217,7 +6233,7 @@
         </w:trPr>
         <w:tc>
           <w:tcPr>
-            <w:tcW w:type="pct" w:w="42%"/>
+            <w:tcW w:type="dxa" w:w="4188"/>
             <w:tcBorders>
               <w:top w:val="single" w:color="DEDED9" w:sz="6"/>
               <w:left w:val="none" w:color="FFFFFF" w:sz="0"/>
@@ -6251,7 +6267,7 @@
         </w:tc>
         <w:tc>
           <w:tcPr>
-            <w:tcW w:type="pct" w:w="26%"/>
+            <w:tcW w:type="dxa" w:w="2593"/>
             <w:tcBorders>
               <w:top w:val="single" w:color="DEDED9" w:sz="6"/>
               <w:left w:val="none" w:color="FFFFFF" w:sz="0"/>
@@ -6285,7 +6301,7 @@
         </w:tc>
         <w:tc>
           <w:tcPr>
-            <w:tcW w:type="pct" w:w="32%"/>
+            <w:tcW w:type="dxa" w:w="3191"/>
             <w:tcBorders>
               <w:top w:val="single" w:color="DEDED9" w:sz="6"/>
               <w:left w:val="none" w:color="FFFFFF" w:sz="0"/>
@@ -6324,7 +6340,7 @@
         </w:trPr>
         <w:tc>
           <w:tcPr>
-            <w:tcW w:type="pct" w:w="42%"/>
+            <w:tcW w:type="dxa" w:w="4188"/>
             <w:tcBorders>
               <w:top w:val="single" w:color="DEDED9" w:sz="6"/>
               <w:left w:val="none" w:color="FFFFFF" w:sz="0"/>
@@ -6355,7 +6371,7 @@
         </w:tc>
         <w:tc>
           <w:tcPr>
-            <w:tcW w:type="pct" w:w="26%"/>
+            <w:tcW w:type="dxa" w:w="2593"/>
             <w:tcBorders>
               <w:top w:val="single" w:color="DEDED9" w:sz="6"/>
               <w:left w:val="none" w:color="FFFFFF" w:sz="0"/>
@@ -6386,7 +6402,7 @@
         </w:tc>
         <w:tc>
           <w:tcPr>
-            <w:tcW w:type="pct" w:w="32%"/>
+            <w:tcW w:type="dxa" w:w="3191"/>
             <w:tcBorders>
               <w:top w:val="single" w:color="DEDED9" w:sz="6"/>
               <w:left w:val="none" w:color="FFFFFF" w:sz="0"/>
@@ -6422,7 +6438,7 @@
         </w:trPr>
         <w:tc>
           <w:tcPr>
-            <w:tcW w:type="pct" w:w="42%"/>
+            <w:tcW w:type="dxa" w:w="4188"/>
             <w:tcBorders>
               <w:top w:val="single" w:color="DEDED9" w:sz="6"/>
               <w:left w:val="none" w:color="FFFFFF" w:sz="0"/>
@@ -6453,7 +6469,7 @@
         </w:tc>
         <w:tc>
           <w:tcPr>
-            <w:tcW w:type="pct" w:w="26%"/>
+            <w:tcW w:type="dxa" w:w="2593"/>
             <w:tcBorders>
               <w:top w:val="single" w:color="DEDED9" w:sz="6"/>
               <w:left w:val="none" w:color="FFFFFF" w:sz="0"/>
@@ -6484,7 +6500,7 @@
         </w:tc>
         <w:tc>
           <w:tcPr>
-            <w:tcW w:type="pct" w:w="32%"/>
+            <w:tcW w:type="dxa" w:w="3191"/>
             <w:tcBorders>
               <w:top w:val="single" w:color="DEDED9" w:sz="6"/>
               <w:left w:val="none" w:color="FFFFFF" w:sz="0"/>
@@ -6520,7 +6536,7 @@
         </w:trPr>
         <w:tc>
           <w:tcPr>
-            <w:tcW w:type="pct" w:w="42%"/>
+            <w:tcW w:type="dxa" w:w="4188"/>
             <w:tcBorders>
               <w:top w:val="single" w:color="DEDED9" w:sz="6"/>
               <w:left w:val="none" w:color="FFFFFF" w:sz="0"/>
@@ -6551,7 +6567,7 @@
         </w:tc>
         <w:tc>
           <w:tcPr>
-            <w:tcW w:type="pct" w:w="26%"/>
+            <w:tcW w:type="dxa" w:w="2593"/>
             <w:tcBorders>
               <w:top w:val="single" w:color="DEDED9" w:sz="6"/>
               <w:left w:val="none" w:color="FFFFFF" w:sz="0"/>
@@ -6582,7 +6598,7 @@
         </w:tc>
         <w:tc>
           <w:tcPr>
-            <w:tcW w:type="pct" w:w="32%"/>
+            <w:tcW w:type="dxa" w:w="3191"/>
             <w:tcBorders>
               <w:top w:val="single" w:color="DEDED9" w:sz="6"/>
               <w:left w:val="none" w:color="FFFFFF" w:sz="0"/>
@@ -6632,7 +6648,7 @@
     </w:p>
     <w:tbl>
       <w:tblPr>
-        <w:tblW w:type="pct" w:w="100%"/>
+        <w:tblW w:type="dxa" w:w="9972"/>
         <w:tblBorders>
           <w:top w:val="single" w:color="auto" w:sz="4"/>
           <w:left w:val="single" w:color="auto" w:sz="4"/>
@@ -6641,11 +6657,12 @@
           <w:insideH w:val="single" w:color="auto" w:sz="4"/>
           <w:insideV w:val="single" w:color="auto" w:sz="4"/>
         </w:tblBorders>
+        <w:tblLayout w:type="fixed"/>
       </w:tblPr>
       <w:tblGrid>
-        <w:gridCol w:w="100"/>
-        <w:gridCol w:w="100"/>
-        <w:gridCol w:w="100"/>
+        <w:gridCol w:w="4188"/>
+        <w:gridCol w:w="2593"/>
+        <w:gridCol w:w="3191"/>
       </w:tblGrid>
       <w:tr>
         <w:trPr>
@@ -6653,7 +6670,7 @@
         </w:trPr>
         <w:tc>
           <w:tcPr>
-            <w:tcW w:type="pct" w:w="42%"/>
+            <w:tcW w:type="dxa" w:w="4188"/>
             <w:tcBorders>
               <w:top w:val="single" w:color="DEDED9" w:sz="6"/>
               <w:left w:val="none" w:color="FFFFFF" w:sz="0"/>
@@ -6687,7 +6704,7 @@
         </w:tc>
         <w:tc>
           <w:tcPr>
-            <w:tcW w:type="pct" w:w="26%"/>
+            <w:tcW w:type="dxa" w:w="2593"/>
             <w:tcBorders>
               <w:top w:val="single" w:color="DEDED9" w:sz="6"/>
               <w:left w:val="none" w:color="FFFFFF" w:sz="0"/>
@@ -6721,7 +6738,7 @@
         </w:tc>
         <w:tc>
           <w:tcPr>
-            <w:tcW w:type="pct" w:w="32%"/>
+            <w:tcW w:type="dxa" w:w="3191"/>
             <w:tcBorders>
               <w:top w:val="single" w:color="DEDED9" w:sz="6"/>
               <w:left w:val="none" w:color="FFFFFF" w:sz="0"/>
@@ -6760,7 +6777,7 @@
         </w:trPr>
         <w:tc>
           <w:tcPr>
-            <w:tcW w:type="pct" w:w="42%"/>
+            <w:tcW w:type="dxa" w:w="4188"/>
             <w:tcBorders>
               <w:top w:val="single" w:color="DEDED9" w:sz="6"/>
               <w:left w:val="none" w:color="FFFFFF" w:sz="0"/>
@@ -6791,7 +6808,7 @@
         </w:tc>
         <w:tc>
           <w:tcPr>
-            <w:tcW w:type="pct" w:w="26%"/>
+            <w:tcW w:type="dxa" w:w="2593"/>
             <w:tcBorders>
               <w:top w:val="single" w:color="DEDED9" w:sz="6"/>
               <w:left w:val="none" w:color="FFFFFF" w:sz="0"/>
@@ -6822,7 +6839,7 @@
         </w:tc>
         <w:tc>
           <w:tcPr>
-            <w:tcW w:type="pct" w:w="32%"/>
+            <w:tcW w:type="dxa" w:w="3191"/>
             <w:tcBorders>
               <w:top w:val="single" w:color="DEDED9" w:sz="6"/>
               <w:left w:val="none" w:color="FFFFFF" w:sz="0"/>
@@ -6858,7 +6875,7 @@
         </w:trPr>
         <w:tc>
           <w:tcPr>
-            <w:tcW w:type="pct" w:w="42%"/>
+            <w:tcW w:type="dxa" w:w="4188"/>
             <w:tcBorders>
               <w:top w:val="single" w:color="DEDED9" w:sz="6"/>
               <w:left w:val="none" w:color="FFFFFF" w:sz="0"/>
@@ -6889,7 +6906,7 @@
         </w:tc>
         <w:tc>
           <w:tcPr>
-            <w:tcW w:type="pct" w:w="26%"/>
+            <w:tcW w:type="dxa" w:w="2593"/>
             <w:tcBorders>
               <w:top w:val="single" w:color="DEDED9" w:sz="6"/>
               <w:left w:val="none" w:color="FFFFFF" w:sz="0"/>
@@ -6920,7 +6937,7 @@
         </w:tc>
         <w:tc>
           <w:tcPr>
-            <w:tcW w:type="pct" w:w="32%"/>
+            <w:tcW w:type="dxa" w:w="3191"/>
             <w:tcBorders>
               <w:top w:val="single" w:color="DEDED9" w:sz="6"/>
               <w:left w:val="none" w:color="FFFFFF" w:sz="0"/>
@@ -6956,7 +6973,7 @@
         </w:trPr>
         <w:tc>
           <w:tcPr>
-            <w:tcW w:type="pct" w:w="42%"/>
+            <w:tcW w:type="dxa" w:w="4188"/>
             <w:tcBorders>
               <w:top w:val="single" w:color="DEDED9" w:sz="6"/>
               <w:left w:val="none" w:color="FFFFFF" w:sz="0"/>
@@ -6987,7 +7004,7 @@
         </w:tc>
         <w:tc>
           <w:tcPr>
-            <w:tcW w:type="pct" w:w="26%"/>
+            <w:tcW w:type="dxa" w:w="2593"/>
             <w:tcBorders>
               <w:top w:val="single" w:color="DEDED9" w:sz="6"/>
               <w:left w:val="none" w:color="FFFFFF" w:sz="0"/>
@@ -7018,7 +7035,7 @@
         </w:tc>
         <w:tc>
           <w:tcPr>
-            <w:tcW w:type="pct" w:w="32%"/>
+            <w:tcW w:type="dxa" w:w="3191"/>
             <w:tcBorders>
               <w:top w:val="single" w:color="DEDED9" w:sz="6"/>
               <w:left w:val="none" w:color="FFFFFF" w:sz="0"/>
@@ -7068,7 +7085,7 @@
     </w:p>
     <w:tbl>
       <w:tblPr>
-        <w:tblW w:type="pct" w:w="100%"/>
+        <w:tblW w:type="dxa" w:w="9972"/>
         <w:tblBorders>
           <w:top w:val="single" w:color="auto" w:sz="4"/>
           <w:left w:val="single" w:color="auto" w:sz="4"/>
@@ -7077,11 +7094,12 @@
           <w:insideH w:val="single" w:color="auto" w:sz="4"/>
           <w:insideV w:val="single" w:color="auto" w:sz="4"/>
         </w:tblBorders>
+        <w:tblLayout w:type="fixed"/>
       </w:tblPr>
       <w:tblGrid>
-        <w:gridCol w:w="100"/>
-        <w:gridCol w:w="100"/>
-        <w:gridCol w:w="100"/>
+        <w:gridCol w:w="4188"/>
+        <w:gridCol w:w="2593"/>
+        <w:gridCol w:w="3191"/>
       </w:tblGrid>
       <w:tr>
         <w:trPr>
@@ -7089,7 +7107,7 @@
         </w:trPr>
         <w:tc>
           <w:tcPr>
-            <w:tcW w:type="pct" w:w="42%"/>
+            <w:tcW w:type="dxa" w:w="4188"/>
             <w:tcBorders>
               <w:top w:val="single" w:color="DEDED9" w:sz="6"/>
               <w:left w:val="none" w:color="FFFFFF" w:sz="0"/>
@@ -7123,7 +7141,7 @@
         </w:tc>
         <w:tc>
           <w:tcPr>
-            <w:tcW w:type="pct" w:w="26%"/>
+            <w:tcW w:type="dxa" w:w="2593"/>
             <w:tcBorders>
               <w:top w:val="single" w:color="DEDED9" w:sz="6"/>
               <w:left w:val="none" w:color="FFFFFF" w:sz="0"/>
@@ -7157,7 +7175,7 @@
         </w:tc>
         <w:tc>
           <w:tcPr>
-            <w:tcW w:type="pct" w:w="32%"/>
+            <w:tcW w:type="dxa" w:w="3191"/>
             <w:tcBorders>
               <w:top w:val="single" w:color="DEDED9" w:sz="6"/>
               <w:left w:val="none" w:color="FFFFFF" w:sz="0"/>
@@ -7196,7 +7214,7 @@
         </w:trPr>
         <w:tc>
           <w:tcPr>
-            <w:tcW w:type="pct" w:w="42%"/>
+            <w:tcW w:type="dxa" w:w="4188"/>
             <w:tcBorders>
               <w:top w:val="single" w:color="DEDED9" w:sz="6"/>
               <w:left w:val="none" w:color="FFFFFF" w:sz="0"/>
@@ -7227,7 +7245,7 @@
         </w:tc>
         <w:tc>
           <w:tcPr>
-            <w:tcW w:type="pct" w:w="26%"/>
+            <w:tcW w:type="dxa" w:w="2593"/>
             <w:tcBorders>
               <w:top w:val="single" w:color="DEDED9" w:sz="6"/>
               <w:left w:val="none" w:color="FFFFFF" w:sz="0"/>
@@ -7258,7 +7276,7 @@
         </w:tc>
         <w:tc>
           <w:tcPr>
-            <w:tcW w:type="pct" w:w="32%"/>
+            <w:tcW w:type="dxa" w:w="3191"/>
             <w:tcBorders>
               <w:top w:val="single" w:color="DEDED9" w:sz="6"/>
               <w:left w:val="none" w:color="FFFFFF" w:sz="0"/>
@@ -7294,7 +7312,7 @@
         </w:trPr>
         <w:tc>
           <w:tcPr>
-            <w:tcW w:type="pct" w:w="42%"/>
+            <w:tcW w:type="dxa" w:w="4188"/>
             <w:tcBorders>
               <w:top w:val="single" w:color="DEDED9" w:sz="6"/>
               <w:left w:val="none" w:color="FFFFFF" w:sz="0"/>
@@ -7325,7 +7343,7 @@
         </w:tc>
         <w:tc>
           <w:tcPr>
-            <w:tcW w:type="pct" w:w="26%"/>
+            <w:tcW w:type="dxa" w:w="2593"/>
             <w:tcBorders>
               <w:top w:val="single" w:color="DEDED9" w:sz="6"/>
               <w:left w:val="none" w:color="FFFFFF" w:sz="0"/>
@@ -7356,7 +7374,7 @@
         </w:tc>
         <w:tc>
           <w:tcPr>
-            <w:tcW w:type="pct" w:w="32%"/>
+            <w:tcW w:type="dxa" w:w="3191"/>
             <w:tcBorders>
               <w:top w:val="single" w:color="DEDED9" w:sz="6"/>
               <w:left w:val="none" w:color="FFFFFF" w:sz="0"/>
@@ -7392,7 +7410,7 @@
         </w:trPr>
         <w:tc>
           <w:tcPr>
-            <w:tcW w:type="pct" w:w="42%"/>
+            <w:tcW w:type="dxa" w:w="4188"/>
             <w:tcBorders>
               <w:top w:val="single" w:color="DEDED9" w:sz="6"/>
               <w:left w:val="none" w:color="FFFFFF" w:sz="0"/>
@@ -7423,7 +7441,7 @@
         </w:tc>
         <w:tc>
           <w:tcPr>
-            <w:tcW w:type="pct" w:w="26%"/>
+            <w:tcW w:type="dxa" w:w="2593"/>
             <w:tcBorders>
               <w:top w:val="single" w:color="DEDED9" w:sz="6"/>
               <w:left w:val="none" w:color="FFFFFF" w:sz="0"/>
@@ -7454,7 +7472,7 @@
         </w:tc>
         <w:tc>
           <w:tcPr>
-            <w:tcW w:type="pct" w:w="32%"/>
+            <w:tcW w:type="dxa" w:w="3191"/>
             <w:tcBorders>
               <w:top w:val="single" w:color="DEDED9" w:sz="6"/>
               <w:left w:val="none" w:color="FFFFFF" w:sz="0"/>
@@ -7490,7 +7508,7 @@
         </w:trPr>
         <w:tc>
           <w:tcPr>
-            <w:tcW w:type="pct" w:w="42%"/>
+            <w:tcW w:type="dxa" w:w="4188"/>
             <w:tcBorders>
               <w:top w:val="single" w:color="DEDED9" w:sz="6"/>
               <w:left w:val="none" w:color="FFFFFF" w:sz="0"/>
@@ -7521,7 +7539,7 @@
         </w:tc>
         <w:tc>
           <w:tcPr>
-            <w:tcW w:type="pct" w:w="26%"/>
+            <w:tcW w:type="dxa" w:w="2593"/>
             <w:tcBorders>
               <w:top w:val="single" w:color="DEDED9" w:sz="6"/>
               <w:left w:val="none" w:color="FFFFFF" w:sz="0"/>
@@ -7552,7 +7570,7 @@
         </w:tc>
         <w:tc>
           <w:tcPr>
-            <w:tcW w:type="pct" w:w="32%"/>
+            <w:tcW w:type="dxa" w:w="3191"/>
             <w:tcBorders>
               <w:top w:val="single" w:color="DEDED9" w:sz="6"/>
               <w:left w:val="none" w:color="FFFFFF" w:sz="0"/>
@@ -7588,7 +7606,7 @@
         </w:trPr>
         <w:tc>
           <w:tcPr>
-            <w:tcW w:type="pct" w:w="42%"/>
+            <w:tcW w:type="dxa" w:w="4188"/>
             <w:tcBorders>
               <w:top w:val="single" w:color="DEDED9" w:sz="6"/>
               <w:left w:val="none" w:color="FFFFFF" w:sz="0"/>
@@ -7619,7 +7637,7 @@
         </w:tc>
         <w:tc>
           <w:tcPr>
-            <w:tcW w:type="pct" w:w="26%"/>
+            <w:tcW w:type="dxa" w:w="2593"/>
             <w:tcBorders>
               <w:top w:val="single" w:color="DEDED9" w:sz="6"/>
               <w:left w:val="none" w:color="FFFFFF" w:sz="0"/>
@@ -7650,7 +7668,7 @@
         </w:tc>
         <w:tc>
           <w:tcPr>
-            <w:tcW w:type="pct" w:w="32%"/>
+            <w:tcW w:type="dxa" w:w="3191"/>
             <w:tcBorders>
               <w:top w:val="single" w:color="DEDED9" w:sz="6"/>
               <w:left w:val="none" w:color="FFFFFF" w:sz="0"/>
@@ -7700,7 +7718,7 @@
     </w:p>
     <w:tbl>
       <w:tblPr>
-        <w:tblW w:type="pct" w:w="100%"/>
+        <w:tblW w:type="dxa" w:w="9972"/>
         <w:tblBorders>
           <w:top w:val="single" w:color="auto" w:sz="4"/>
           <w:left w:val="single" w:color="auto" w:sz="4"/>
@@ -7709,11 +7727,12 @@
           <w:insideH w:val="single" w:color="auto" w:sz="4"/>
           <w:insideV w:val="single" w:color="auto" w:sz="4"/>
         </w:tblBorders>
+        <w:tblLayout w:type="fixed"/>
       </w:tblPr>
       <w:tblGrid>
-        <w:gridCol w:w="100"/>
-        <w:gridCol w:w="100"/>
-        <w:gridCol w:w="100"/>
+        <w:gridCol w:w="4188"/>
+        <w:gridCol w:w="2593"/>
+        <w:gridCol w:w="3191"/>
       </w:tblGrid>
       <w:tr>
         <w:trPr>
@@ -7721,7 +7740,7 @@
         </w:trPr>
         <w:tc>
           <w:tcPr>
-            <w:tcW w:type="pct" w:w="42%"/>
+            <w:tcW w:type="dxa" w:w="4188"/>
             <w:tcBorders>
               <w:top w:val="single" w:color="DEDED9" w:sz="6"/>
               <w:left w:val="none" w:color="FFFFFF" w:sz="0"/>
@@ -7755,7 +7774,7 @@
         </w:tc>
         <w:tc>
           <w:tcPr>
-            <w:tcW w:type="pct" w:w="26%"/>
+            <w:tcW w:type="dxa" w:w="2593"/>
             <w:tcBorders>
               <w:top w:val="single" w:color="DEDED9" w:sz="6"/>
               <w:left w:val="none" w:color="FFFFFF" w:sz="0"/>
@@ -7789,7 +7808,7 @@
         </w:tc>
         <w:tc>
           <w:tcPr>
-            <w:tcW w:type="pct" w:w="32%"/>
+            <w:tcW w:type="dxa" w:w="3191"/>
             <w:tcBorders>
               <w:top w:val="single" w:color="DEDED9" w:sz="6"/>
               <w:left w:val="none" w:color="FFFFFF" w:sz="0"/>
@@ -7828,7 +7847,7 @@
         </w:trPr>
         <w:tc>
           <w:tcPr>
-            <w:tcW w:type="pct" w:w="42%"/>
+            <w:tcW w:type="dxa" w:w="4188"/>
             <w:tcBorders>
               <w:top w:val="single" w:color="DEDED9" w:sz="6"/>
               <w:left w:val="none" w:color="FFFFFF" w:sz="0"/>
@@ -7859,7 +7878,7 @@
         </w:tc>
         <w:tc>
           <w:tcPr>
-            <w:tcW w:type="pct" w:w="26%"/>
+            <w:tcW w:type="dxa" w:w="2593"/>
             <w:tcBorders>
               <w:top w:val="single" w:color="DEDED9" w:sz="6"/>
               <w:left w:val="none" w:color="FFFFFF" w:sz="0"/>
@@ -7890,7 +7909,7 @@
         </w:tc>
         <w:tc>
           <w:tcPr>
-            <w:tcW w:type="pct" w:w="32%"/>
+            <w:tcW w:type="dxa" w:w="3191"/>
             <w:tcBorders>
               <w:top w:val="single" w:color="DEDED9" w:sz="6"/>
               <w:left w:val="none" w:color="FFFFFF" w:sz="0"/>
@@ -7926,7 +7945,7 @@
         </w:trPr>
         <w:tc>
           <w:tcPr>
-            <w:tcW w:type="pct" w:w="42%"/>
+            <w:tcW w:type="dxa" w:w="4188"/>
             <w:tcBorders>
               <w:top w:val="single" w:color="DEDED9" w:sz="6"/>
               <w:left w:val="none" w:color="FFFFFF" w:sz="0"/>
@@ -7957,7 +7976,7 @@
         </w:tc>
         <w:tc>
           <w:tcPr>
-            <w:tcW w:type="pct" w:w="26%"/>
+            <w:tcW w:type="dxa" w:w="2593"/>
             <w:tcBorders>
               <w:top w:val="single" w:color="DEDED9" w:sz="6"/>
               <w:left w:val="none" w:color="FFFFFF" w:sz="0"/>
@@ -7988,7 +8007,7 @@
         </w:tc>
         <w:tc>
           <w:tcPr>
-            <w:tcW w:type="pct" w:w="32%"/>
+            <w:tcW w:type="dxa" w:w="3191"/>
             <w:tcBorders>
               <w:top w:val="single" w:color="DEDED9" w:sz="6"/>
               <w:left w:val="none" w:color="FFFFFF" w:sz="0"/>
@@ -8024,7 +8043,7 @@
         </w:trPr>
         <w:tc>
           <w:tcPr>
-            <w:tcW w:type="pct" w:w="42%"/>
+            <w:tcW w:type="dxa" w:w="4188"/>
             <w:tcBorders>
               <w:top w:val="single" w:color="DEDED9" w:sz="6"/>
               <w:left w:val="none" w:color="FFFFFF" w:sz="0"/>
@@ -8055,7 +8074,7 @@
         </w:tc>
         <w:tc>
           <w:tcPr>
-            <w:tcW w:type="pct" w:w="26%"/>
+            <w:tcW w:type="dxa" w:w="2593"/>
             <w:tcBorders>
               <w:top w:val="single" w:color="DEDED9" w:sz="6"/>
               <w:left w:val="none" w:color="FFFFFF" w:sz="0"/>
@@ -8086,7 +8105,7 @@
         </w:tc>
         <w:tc>
           <w:tcPr>
-            <w:tcW w:type="pct" w:w="32%"/>
+            <w:tcW w:type="dxa" w:w="3191"/>
             <w:tcBorders>
               <w:top w:val="single" w:color="DEDED9" w:sz="6"/>
               <w:left w:val="none" w:color="FFFFFF" w:sz="0"/>
@@ -8136,7 +8155,7 @@
     </w:p>
     <w:tbl>
       <w:tblPr>
-        <w:tblW w:type="pct" w:w="100%"/>
+        <w:tblW w:type="dxa" w:w="9972"/>
         <w:tblBorders>
           <w:top w:val="single" w:color="auto" w:sz="4"/>
           <w:left w:val="single" w:color="auto" w:sz="4"/>
@@ -8145,11 +8164,12 @@
           <w:insideH w:val="single" w:color="auto" w:sz="4"/>
           <w:insideV w:val="single" w:color="auto" w:sz="4"/>
         </w:tblBorders>
+        <w:tblLayout w:type="fixed"/>
       </w:tblPr>
       <w:tblGrid>
-        <w:gridCol w:w="100"/>
-        <w:gridCol w:w="100"/>
-        <w:gridCol w:w="100"/>
+        <w:gridCol w:w="4188"/>
+        <w:gridCol w:w="2593"/>
+        <w:gridCol w:w="3191"/>
       </w:tblGrid>
       <w:tr>
         <w:trPr>
@@ -8157,7 +8177,7 @@
         </w:trPr>
         <w:tc>
           <w:tcPr>
-            <w:tcW w:type="pct" w:w="42%"/>
+            <w:tcW w:type="dxa" w:w="4188"/>
             <w:tcBorders>
               <w:top w:val="single" w:color="DEDED9" w:sz="6"/>
               <w:left w:val="none" w:color="FFFFFF" w:sz="0"/>
@@ -8191,7 +8211,7 @@
         </w:tc>
         <w:tc>
           <w:tcPr>
-            <w:tcW w:type="pct" w:w="26%"/>
+            <w:tcW w:type="dxa" w:w="2593"/>
             <w:tcBorders>
               <w:top w:val="single" w:color="DEDED9" w:sz="6"/>
               <w:left w:val="none" w:color="FFFFFF" w:sz="0"/>
@@ -8225,7 +8245,7 @@
         </w:tc>
         <w:tc>
           <w:tcPr>
-            <w:tcW w:type="pct" w:w="32%"/>
+            <w:tcW w:type="dxa" w:w="3191"/>
             <w:tcBorders>
               <w:top w:val="single" w:color="DEDED9" w:sz="6"/>
               <w:left w:val="none" w:color="FFFFFF" w:sz="0"/>
@@ -8264,7 +8284,7 @@
         </w:trPr>
         <w:tc>
           <w:tcPr>
-            <w:tcW w:type="pct" w:w="42%"/>
+            <w:tcW w:type="dxa" w:w="4188"/>
             <w:tcBorders>
               <w:top w:val="single" w:color="DEDED9" w:sz="6"/>
               <w:left w:val="none" w:color="FFFFFF" w:sz="0"/>
@@ -8295,7 +8315,7 @@
         </w:tc>
         <w:tc>
           <w:tcPr>
-            <w:tcW w:type="pct" w:w="26%"/>
+            <w:tcW w:type="dxa" w:w="2593"/>
             <w:tcBorders>
               <w:top w:val="single" w:color="DEDED9" w:sz="6"/>
               <w:left w:val="none" w:color="FFFFFF" w:sz="0"/>
@@ -8326,7 +8346,7 @@
         </w:tc>
         <w:tc>
           <w:tcPr>
-            <w:tcW w:type="pct" w:w="32%"/>
+            <w:tcW w:type="dxa" w:w="3191"/>
             <w:tcBorders>
               <w:top w:val="single" w:color="DEDED9" w:sz="6"/>
               <w:left w:val="none" w:color="FFFFFF" w:sz="0"/>
@@ -8362,7 +8382,7 @@
         </w:trPr>
         <w:tc>
           <w:tcPr>
-            <w:tcW w:type="pct" w:w="42%"/>
+            <w:tcW w:type="dxa" w:w="4188"/>
             <w:tcBorders>
               <w:top w:val="single" w:color="DEDED9" w:sz="6"/>
               <w:left w:val="none" w:color="FFFFFF" w:sz="0"/>
@@ -8393,7 +8413,7 @@
         </w:tc>
         <w:tc>
           <w:tcPr>
-            <w:tcW w:type="pct" w:w="26%"/>
+            <w:tcW w:type="dxa" w:w="2593"/>
             <w:tcBorders>
               <w:top w:val="single" w:color="DEDED9" w:sz="6"/>
               <w:left w:val="none" w:color="FFFFFF" w:sz="0"/>
@@ -8424,7 +8444,7 @@
         </w:tc>
         <w:tc>
           <w:tcPr>
-            <w:tcW w:type="pct" w:w="32%"/>
+            <w:tcW w:type="dxa" w:w="3191"/>
             <w:tcBorders>
               <w:top w:val="single" w:color="DEDED9" w:sz="6"/>
               <w:left w:val="none" w:color="FFFFFF" w:sz="0"/>
@@ -8474,7 +8494,7 @@
     </w:p>
     <w:tbl>
       <w:tblPr>
-        <w:tblW w:type="pct" w:w="100%"/>
+        <w:tblW w:type="dxa" w:w="9972"/>
         <w:tblBorders>
           <w:top w:val="single" w:color="auto" w:sz="4"/>
           <w:left w:val="single" w:color="auto" w:sz="4"/>
@@ -8483,12 +8503,13 @@
           <w:insideH w:val="single" w:color="auto" w:sz="4"/>
           <w:insideV w:val="single" w:color="auto" w:sz="4"/>
         </w:tblBorders>
+        <w:tblLayout w:type="fixed"/>
       </w:tblPr>
       <w:tblGrid>
-        <w:gridCol w:w="100"/>
-        <w:gridCol w:w="100"/>
-        <w:gridCol w:w="100"/>
-        <w:gridCol w:w="100"/>
+        <w:gridCol w:w="1596"/>
+        <w:gridCol w:w="2593"/>
+        <w:gridCol w:w="3390"/>
+        <w:gridCol w:w="2393"/>
       </w:tblGrid>
       <w:tr>
         <w:trPr>
@@ -8496,7 +8517,7 @@
         </w:trPr>
         <w:tc>
           <w:tcPr>
-            <w:tcW w:type="pct" w:w="16%"/>
+            <w:tcW w:type="dxa" w:w="1596"/>
             <w:tcBorders>
               <w:top w:val="single" w:color="DEDED9" w:sz="6"/>
               <w:left w:val="none" w:color="FFFFFF" w:sz="0"/>
@@ -8530,7 +8551,7 @@
         </w:tc>
         <w:tc>
           <w:tcPr>
-            <w:tcW w:type="pct" w:w="26%"/>
+            <w:tcW w:type="dxa" w:w="2593"/>
             <w:tcBorders>
               <w:top w:val="single" w:color="DEDED9" w:sz="6"/>
               <w:left w:val="none" w:color="FFFFFF" w:sz="0"/>
@@ -8564,7 +8585,7 @@
         </w:tc>
         <w:tc>
           <w:tcPr>
-            <w:tcW w:type="pct" w:w="34%"/>
+            <w:tcW w:type="dxa" w:w="3390"/>
             <w:tcBorders>
               <w:top w:val="single" w:color="DEDED9" w:sz="6"/>
               <w:left w:val="none" w:color="FFFFFF" w:sz="0"/>
@@ -8598,7 +8619,7 @@
         </w:tc>
         <w:tc>
           <w:tcPr>
-            <w:tcW w:type="pct" w:w="24%"/>
+            <w:tcW w:type="dxa" w:w="2393"/>
             <w:tcBorders>
               <w:top w:val="single" w:color="DEDED9" w:sz="6"/>
               <w:left w:val="none" w:color="FFFFFF" w:sz="0"/>
@@ -8637,7 +8658,7 @@
         </w:trPr>
         <w:tc>
           <w:tcPr>
-            <w:tcW w:type="pct" w:w="16%"/>
+            <w:tcW w:type="dxa" w:w="1596"/>
             <w:tcBorders>
               <w:top w:val="single" w:color="DEDED9" w:sz="6"/>
               <w:left w:val="none" w:color="FFFFFF" w:sz="0"/>
@@ -8668,7 +8689,7 @@
         </w:tc>
         <w:tc>
           <w:tcPr>
-            <w:tcW w:type="pct" w:w="26%"/>
+            <w:tcW w:type="dxa" w:w="2593"/>
             <w:tcBorders>
               <w:top w:val="single" w:color="DEDED9" w:sz="6"/>
               <w:left w:val="none" w:color="FFFFFF" w:sz="0"/>
@@ -8699,7 +8720,7 @@
         </w:tc>
         <w:tc>
           <w:tcPr>
-            <w:tcW w:type="pct" w:w="34%"/>
+            <w:tcW w:type="dxa" w:w="3390"/>
             <w:tcBorders>
               <w:top w:val="single" w:color="DEDED9" w:sz="6"/>
               <w:left w:val="none" w:color="FFFFFF" w:sz="0"/>
@@ -8730,7 +8751,7 @@
         </w:tc>
         <w:tc>
           <w:tcPr>
-            <w:tcW w:type="pct" w:w="24%"/>
+            <w:tcW w:type="dxa" w:w="2393"/>
             <w:tcBorders>
               <w:top w:val="single" w:color="DEDED9" w:sz="6"/>
               <w:left w:val="none" w:color="FFFFFF" w:sz="0"/>
@@ -8766,7 +8787,7 @@
         </w:trPr>
         <w:tc>
           <w:tcPr>
-            <w:tcW w:type="pct" w:w="16%"/>
+            <w:tcW w:type="dxa" w:w="1596"/>
             <w:tcBorders>
               <w:top w:val="single" w:color="DEDED9" w:sz="6"/>
               <w:left w:val="none" w:color="FFFFFF" w:sz="0"/>
@@ -8797,7 +8818,7 @@
         </w:tc>
         <w:tc>
           <w:tcPr>
-            <w:tcW w:type="pct" w:w="26%"/>
+            <w:tcW w:type="dxa" w:w="2593"/>
             <w:tcBorders>
               <w:top w:val="single" w:color="DEDED9" w:sz="6"/>
               <w:left w:val="none" w:color="FFFFFF" w:sz="0"/>
@@ -8828,7 +8849,7 @@
         </w:tc>
         <w:tc>
           <w:tcPr>
-            <w:tcW w:type="pct" w:w="34%"/>
+            <w:tcW w:type="dxa" w:w="3390"/>
             <w:tcBorders>
               <w:top w:val="single" w:color="DEDED9" w:sz="6"/>
               <w:left w:val="none" w:color="FFFFFF" w:sz="0"/>
@@ -8859,7 +8880,7 @@
         </w:tc>
         <w:tc>
           <w:tcPr>
-            <w:tcW w:type="pct" w:w="24%"/>
+            <w:tcW w:type="dxa" w:w="2393"/>
             <w:tcBorders>
               <w:top w:val="single" w:color="DEDED9" w:sz="6"/>
               <w:left w:val="none" w:color="FFFFFF" w:sz="0"/>
@@ -8895,7 +8916,7 @@
         </w:trPr>
         <w:tc>
           <w:tcPr>
-            <w:tcW w:type="pct" w:w="16%"/>
+            <w:tcW w:type="dxa" w:w="1596"/>
             <w:tcBorders>
               <w:top w:val="single" w:color="DEDED9" w:sz="6"/>
               <w:left w:val="none" w:color="FFFFFF" w:sz="0"/>
@@ -8926,7 +8947,7 @@
         </w:tc>
         <w:tc>
           <w:tcPr>
-            <w:tcW w:type="pct" w:w="26%"/>
+            <w:tcW w:type="dxa" w:w="2593"/>
             <w:tcBorders>
               <w:top w:val="single" w:color="DEDED9" w:sz="6"/>
               <w:left w:val="none" w:color="FFFFFF" w:sz="0"/>
@@ -8957,7 +8978,7 @@
         </w:tc>
         <w:tc>
           <w:tcPr>
-            <w:tcW w:type="pct" w:w="34%"/>
+            <w:tcW w:type="dxa" w:w="3390"/>
             <w:tcBorders>
               <w:top w:val="single" w:color="DEDED9" w:sz="6"/>
               <w:left w:val="none" w:color="FFFFFF" w:sz="0"/>
@@ -8988,7 +9009,7 @@
         </w:tc>
         <w:tc>
           <w:tcPr>
-            <w:tcW w:type="pct" w:w="24%"/>
+            <w:tcW w:type="dxa" w:w="2393"/>
             <w:tcBorders>
               <w:top w:val="single" w:color="DEDED9" w:sz="6"/>
               <w:left w:val="none" w:color="FFFFFF" w:sz="0"/>
@@ -9024,7 +9045,7 @@
         </w:trPr>
         <w:tc>
           <w:tcPr>
-            <w:tcW w:type="pct" w:w="16%"/>
+            <w:tcW w:type="dxa" w:w="1596"/>
             <w:tcBorders>
               <w:top w:val="single" w:color="DEDED9" w:sz="6"/>
               <w:left w:val="none" w:color="FFFFFF" w:sz="0"/>
@@ -9055,7 +9076,7 @@
         </w:tc>
         <w:tc>
           <w:tcPr>
-            <w:tcW w:type="pct" w:w="26%"/>
+            <w:tcW w:type="dxa" w:w="2593"/>
             <w:tcBorders>
               <w:top w:val="single" w:color="DEDED9" w:sz="6"/>
               <w:left w:val="none" w:color="FFFFFF" w:sz="0"/>
@@ -9086,7 +9107,7 @@
         </w:tc>
         <w:tc>
           <w:tcPr>
-            <w:tcW w:type="pct" w:w="34%"/>
+            <w:tcW w:type="dxa" w:w="3390"/>
             <w:tcBorders>
               <w:top w:val="single" w:color="DEDED9" w:sz="6"/>
               <w:left w:val="none" w:color="FFFFFF" w:sz="0"/>
@@ -9117,7 +9138,7 @@
         </w:tc>
         <w:tc>
           <w:tcPr>
-            <w:tcW w:type="pct" w:w="24%"/>
+            <w:tcW w:type="dxa" w:w="2393"/>
             <w:tcBorders>
               <w:top w:val="single" w:color="DEDED9" w:sz="6"/>
               <w:left w:val="none" w:color="FFFFFF" w:sz="0"/>
@@ -9181,7 +9202,7 @@
     </w:p>
     <w:tbl>
       <w:tblPr>
-        <w:tblW w:type="pct" w:w="100%"/>
+        <w:tblW w:type="dxa" w:w="9972"/>
         <w:tblBorders>
           <w:top w:val="single" w:color="auto" w:sz="4"/>
           <w:left w:val="single" w:color="auto" w:sz="4"/>
@@ -9190,12 +9211,13 @@
           <w:insideH w:val="single" w:color="auto" w:sz="4"/>
           <w:insideV w:val="single" w:color="auto" w:sz="4"/>
         </w:tblBorders>
+        <w:tblLayout w:type="fixed"/>
       </w:tblPr>
       <w:tblGrid>
-        <w:gridCol w:w="100"/>
-        <w:gridCol w:w="100"/>
-        <w:gridCol w:w="100"/>
-        <w:gridCol w:w="100"/>
+        <w:gridCol w:w="3390"/>
+        <w:gridCol w:w="1795"/>
+        <w:gridCol w:w="1994"/>
+        <w:gridCol w:w="2793"/>
       </w:tblGrid>
       <w:tr>
         <w:trPr>
@@ -9203,7 +9225,7 @@
         </w:trPr>
         <w:tc>
           <w:tcPr>
-            <w:tcW w:type="pct" w:w="34%"/>
+            <w:tcW w:type="dxa" w:w="3390"/>
             <w:tcBorders>
               <w:top w:val="single" w:color="DEDED9" w:sz="6"/>
               <w:left w:val="none" w:color="FFFFFF" w:sz="0"/>
@@ -9237,7 +9259,7 @@
         </w:tc>
         <w:tc>
           <w:tcPr>
-            <w:tcW w:type="pct" w:w="18%"/>
+            <w:tcW w:type="dxa" w:w="1795"/>
             <w:tcBorders>
               <w:top w:val="single" w:color="DEDED9" w:sz="6"/>
               <w:left w:val="none" w:color="FFFFFF" w:sz="0"/>
@@ -9271,7 +9293,7 @@
         </w:tc>
         <w:tc>
           <w:tcPr>
-            <w:tcW w:type="pct" w:w="20%"/>
+            <w:tcW w:type="dxa" w:w="1994"/>
             <w:tcBorders>
               <w:top w:val="single" w:color="DEDED9" w:sz="6"/>
               <w:left w:val="none" w:color="FFFFFF" w:sz="0"/>
@@ -9305,7 +9327,7 @@
         </w:tc>
         <w:tc>
           <w:tcPr>
-            <w:tcW w:type="pct" w:w="28%"/>
+            <w:tcW w:type="dxa" w:w="2793"/>
             <w:tcBorders>
               <w:top w:val="single" w:color="DEDED9" w:sz="6"/>
               <w:left w:val="none" w:color="FFFFFF" w:sz="0"/>
@@ -9344,7 +9366,7 @@
         </w:trPr>
         <w:tc>
           <w:tcPr>
-            <w:tcW w:type="pct" w:w="34%"/>
+            <w:tcW w:type="dxa" w:w="3390"/>
             <w:tcBorders>
               <w:top w:val="single" w:color="DEDED9" w:sz="6"/>
               <w:left w:val="none" w:color="FFFFFF" w:sz="0"/>
@@ -9375,7 +9397,7 @@
         </w:tc>
         <w:tc>
           <w:tcPr>
-            <w:tcW w:type="pct" w:w="18%"/>
+            <w:tcW w:type="dxa" w:w="1795"/>
             <w:tcBorders>
               <w:top w:val="single" w:color="DEDED9" w:sz="6"/>
               <w:left w:val="none" w:color="FFFFFF" w:sz="0"/>
@@ -9406,7 +9428,7 @@
         </w:tc>
         <w:tc>
           <w:tcPr>
-            <w:tcW w:type="pct" w:w="20%"/>
+            <w:tcW w:type="dxa" w:w="1994"/>
             <w:tcBorders>
               <w:top w:val="single" w:color="DEDED9" w:sz="6"/>
               <w:left w:val="none" w:color="FFFFFF" w:sz="0"/>
@@ -9437,7 +9459,7 @@
         </w:tc>
         <w:tc>
           <w:tcPr>
-            <w:tcW w:type="pct" w:w="28%"/>
+            <w:tcW w:type="dxa" w:w="2793"/>
             <w:tcBorders>
               <w:top w:val="single" w:color="DEDED9" w:sz="6"/>
               <w:left w:val="none" w:color="FFFFFF" w:sz="0"/>
@@ -9473,7 +9495,7 @@
         </w:trPr>
         <w:tc>
           <w:tcPr>
-            <w:tcW w:type="pct" w:w="34%"/>
+            <w:tcW w:type="dxa" w:w="3390"/>
             <w:tcBorders>
               <w:top w:val="single" w:color="DEDED9" w:sz="6"/>
               <w:left w:val="none" w:color="FFFFFF" w:sz="0"/>
@@ -9504,7 +9526,7 @@
         </w:tc>
         <w:tc>
           <w:tcPr>
-            <w:tcW w:type="pct" w:w="18%"/>
+            <w:tcW w:type="dxa" w:w="1795"/>
             <w:tcBorders>
               <w:top w:val="single" w:color="DEDED9" w:sz="6"/>
               <w:left w:val="none" w:color="FFFFFF" w:sz="0"/>
@@ -9535,7 +9557,7 @@
         </w:tc>
         <w:tc>
           <w:tcPr>
-            <w:tcW w:type="pct" w:w="20%"/>
+            <w:tcW w:type="dxa" w:w="1994"/>
             <w:tcBorders>
               <w:top w:val="single" w:color="DEDED9" w:sz="6"/>
               <w:left w:val="none" w:color="FFFFFF" w:sz="0"/>
@@ -9566,7 +9588,7 @@
         </w:tc>
         <w:tc>
           <w:tcPr>
-            <w:tcW w:type="pct" w:w="28%"/>
+            <w:tcW w:type="dxa" w:w="2793"/>
             <w:tcBorders>
               <w:top w:val="single" w:color="DEDED9" w:sz="6"/>
               <w:left w:val="none" w:color="FFFFFF" w:sz="0"/>
@@ -9602,7 +9624,7 @@
         </w:trPr>
         <w:tc>
           <w:tcPr>
-            <w:tcW w:type="pct" w:w="34%"/>
+            <w:tcW w:type="dxa" w:w="3390"/>
             <w:tcBorders>
               <w:top w:val="single" w:color="DEDED9" w:sz="6"/>
               <w:left w:val="none" w:color="FFFFFF" w:sz="0"/>
@@ -9633,7 +9655,7 @@
         </w:tc>
         <w:tc>
           <w:tcPr>
-            <w:tcW w:type="pct" w:w="18%"/>
+            <w:tcW w:type="dxa" w:w="1795"/>
             <w:tcBorders>
               <w:top w:val="single" w:color="DEDED9" w:sz="6"/>
               <w:left w:val="none" w:color="FFFFFF" w:sz="0"/>
@@ -9664,7 +9686,7 @@
         </w:tc>
         <w:tc>
           <w:tcPr>
-            <w:tcW w:type="pct" w:w="20%"/>
+            <w:tcW w:type="dxa" w:w="1994"/>
             <w:tcBorders>
               <w:top w:val="single" w:color="DEDED9" w:sz="6"/>
               <w:left w:val="none" w:color="FFFFFF" w:sz="0"/>
@@ -9695,7 +9717,7 @@
         </w:tc>
         <w:tc>
           <w:tcPr>
-            <w:tcW w:type="pct" w:w="28%"/>
+            <w:tcW w:type="dxa" w:w="2793"/>
             <w:tcBorders>
               <w:top w:val="single" w:color="DEDED9" w:sz="6"/>
               <w:left w:val="none" w:color="FFFFFF" w:sz="0"/>
@@ -9731,7 +9753,7 @@
         </w:trPr>
         <w:tc>
           <w:tcPr>
-            <w:tcW w:type="pct" w:w="34%"/>
+            <w:tcW w:type="dxa" w:w="3390"/>
             <w:tcBorders>
               <w:top w:val="single" w:color="DEDED9" w:sz="6"/>
               <w:left w:val="none" w:color="FFFFFF" w:sz="0"/>
@@ -9762,7 +9784,7 @@
         </w:tc>
         <w:tc>
           <w:tcPr>
-            <w:tcW w:type="pct" w:w="18%"/>
+            <w:tcW w:type="dxa" w:w="1795"/>
             <w:tcBorders>
               <w:top w:val="single" w:color="DEDED9" w:sz="6"/>
               <w:left w:val="none" w:color="FFFFFF" w:sz="0"/>
@@ -9793,7 +9815,7 @@
         </w:tc>
         <w:tc>
           <w:tcPr>
-            <w:tcW w:type="pct" w:w="20%"/>
+            <w:tcW w:type="dxa" w:w="1994"/>
             <w:tcBorders>
               <w:top w:val="single" w:color="DEDED9" w:sz="6"/>
               <w:left w:val="none" w:color="FFFFFF" w:sz="0"/>
@@ -9824,7 +9846,7 @@
         </w:tc>
         <w:tc>
           <w:tcPr>
-            <w:tcW w:type="pct" w:w="28%"/>
+            <w:tcW w:type="dxa" w:w="2793"/>
             <w:tcBorders>
               <w:top w:val="single" w:color="DEDED9" w:sz="6"/>
               <w:left w:val="none" w:color="FFFFFF" w:sz="0"/>
@@ -9860,7 +9882,7 @@
         </w:trPr>
         <w:tc>
           <w:tcPr>
-            <w:tcW w:type="pct" w:w="34%"/>
+            <w:tcW w:type="dxa" w:w="3390"/>
             <w:tcBorders>
               <w:top w:val="single" w:color="DEDED9" w:sz="6"/>
               <w:left w:val="none" w:color="FFFFFF" w:sz="0"/>
@@ -9891,7 +9913,7 @@
         </w:tc>
         <w:tc>
           <w:tcPr>
-            <w:tcW w:type="pct" w:w="18%"/>
+            <w:tcW w:type="dxa" w:w="1795"/>
             <w:tcBorders>
               <w:top w:val="single" w:color="DEDED9" w:sz="6"/>
               <w:left w:val="none" w:color="FFFFFF" w:sz="0"/>
@@ -9922,7 +9944,7 @@
         </w:tc>
         <w:tc>
           <w:tcPr>
-            <w:tcW w:type="pct" w:w="20%"/>
+            <w:tcW w:type="dxa" w:w="1994"/>
             <w:tcBorders>
               <w:top w:val="single" w:color="DEDED9" w:sz="6"/>
               <w:left w:val="none" w:color="FFFFFF" w:sz="0"/>
@@ -9953,7 +9975,7 @@
         </w:tc>
         <w:tc>
           <w:tcPr>
-            <w:tcW w:type="pct" w:w="28%"/>
+            <w:tcW w:type="dxa" w:w="2793"/>
             <w:tcBorders>
               <w:top w:val="single" w:color="DEDED9" w:sz="6"/>
               <w:left w:val="none" w:color="FFFFFF" w:sz="0"/>
@@ -10017,7 +10039,7 @@
     </w:p>
     <w:tbl>
       <w:tblPr>
-        <w:tblW w:type="pct" w:w="100%"/>
+        <w:tblW w:type="dxa" w:w="9972"/>
         <w:tblBorders>
           <w:top w:val="single" w:color="auto" w:sz="4"/>
           <w:left w:val="single" w:color="auto" w:sz="4"/>
@@ -10026,10 +10048,11 @@
           <w:insideH w:val="single" w:color="auto" w:sz="4"/>
           <w:insideV w:val="single" w:color="auto" w:sz="4"/>
         </w:tblBorders>
+        <w:tblLayout w:type="fixed"/>
       </w:tblPr>
       <w:tblGrid>
-        <w:gridCol w:w="100"/>
-        <w:gridCol w:w="100"/>
+        <w:gridCol w:w="2992"/>
+        <w:gridCol w:w="6980"/>
       </w:tblGrid>
       <w:tr>
         <w:trPr>
@@ -10037,7 +10060,7 @@
         </w:trPr>
         <w:tc>
           <w:tcPr>
-            <w:tcW w:type="pct" w:w="30%"/>
+            <w:tcW w:type="dxa" w:w="2992"/>
             <w:tcBorders>
               <w:top w:val="single" w:color="DEDED9" w:sz="6"/>
               <w:left w:val="none" w:color="FFFFFF" w:sz="0"/>
@@ -10071,7 +10094,7 @@
         </w:tc>
         <w:tc>
           <w:tcPr>
-            <w:tcW w:type="pct" w:w="70%"/>
+            <w:tcW w:type="dxa" w:w="6980"/>
             <w:tcBorders>
               <w:top w:val="single" w:color="DEDED9" w:sz="6"/>
               <w:left w:val="none" w:color="FFFFFF" w:sz="0"/>
@@ -10110,7 +10133,7 @@
         </w:trPr>
         <w:tc>
           <w:tcPr>
-            <w:tcW w:type="pct" w:w="30%"/>
+            <w:tcW w:type="dxa" w:w="2992"/>
             <w:tcBorders>
               <w:top w:val="single" w:color="DEDED9" w:sz="6"/>
               <w:left w:val="none" w:color="FFFFFF" w:sz="0"/>
@@ -10141,7 +10164,7 @@
         </w:tc>
         <w:tc>
           <w:tcPr>
-            <w:tcW w:type="pct" w:w="70%"/>
+            <w:tcW w:type="dxa" w:w="6980"/>
             <w:tcBorders>
               <w:top w:val="single" w:color="DEDED9" w:sz="6"/>
               <w:left w:val="none" w:color="FFFFFF" w:sz="0"/>
@@ -10177,7 +10200,7 @@
         </w:trPr>
         <w:tc>
           <w:tcPr>
-            <w:tcW w:type="pct" w:w="30%"/>
+            <w:tcW w:type="dxa" w:w="2992"/>
             <w:tcBorders>
               <w:top w:val="single" w:color="DEDED9" w:sz="6"/>
               <w:left w:val="none" w:color="FFFFFF" w:sz="0"/>
@@ -10208,7 +10231,7 @@
         </w:tc>
         <w:tc>
           <w:tcPr>
-            <w:tcW w:type="pct" w:w="70%"/>
+            <w:tcW w:type="dxa" w:w="6980"/>
             <w:tcBorders>
               <w:top w:val="single" w:color="DEDED9" w:sz="6"/>
               <w:left w:val="none" w:color="FFFFFF" w:sz="0"/>
@@ -10244,7 +10267,7 @@
         </w:trPr>
         <w:tc>
           <w:tcPr>
-            <w:tcW w:type="pct" w:w="30%"/>
+            <w:tcW w:type="dxa" w:w="2992"/>
             <w:tcBorders>
               <w:top w:val="single" w:color="DEDED9" w:sz="6"/>
               <w:left w:val="none" w:color="FFFFFF" w:sz="0"/>
@@ -10275,7 +10298,7 @@
         </w:tc>
         <w:tc>
           <w:tcPr>
-            <w:tcW w:type="pct" w:w="70%"/>
+            <w:tcW w:type="dxa" w:w="6980"/>
             <w:tcBorders>
               <w:top w:val="single" w:color="DEDED9" w:sz="6"/>
               <w:left w:val="none" w:color="FFFFFF" w:sz="0"/>
@@ -10311,7 +10334,7 @@
         </w:trPr>
         <w:tc>
           <w:tcPr>
-            <w:tcW w:type="pct" w:w="30%"/>
+            <w:tcW w:type="dxa" w:w="2992"/>
             <w:tcBorders>
               <w:top w:val="single" w:color="DEDED9" w:sz="6"/>
               <w:left w:val="none" w:color="FFFFFF" w:sz="0"/>
@@ -10342,7 +10365,7 @@
         </w:tc>
         <w:tc>
           <w:tcPr>
-            <w:tcW w:type="pct" w:w="70%"/>
+            <w:tcW w:type="dxa" w:w="6980"/>
             <w:tcBorders>
               <w:top w:val="single" w:color="DEDED9" w:sz="6"/>
               <w:left w:val="none" w:color="FFFFFF" w:sz="0"/>
@@ -10378,7 +10401,7 @@
         </w:trPr>
         <w:tc>
           <w:tcPr>
-            <w:tcW w:type="pct" w:w="30%"/>
+            <w:tcW w:type="dxa" w:w="2992"/>
             <w:tcBorders>
               <w:top w:val="single" w:color="DEDED9" w:sz="6"/>
               <w:left w:val="none" w:color="FFFFFF" w:sz="0"/>
@@ -10409,7 +10432,7 @@
         </w:tc>
         <w:tc>
           <w:tcPr>
-            <w:tcW w:type="pct" w:w="70%"/>
+            <w:tcW w:type="dxa" w:w="6980"/>
             <w:tcBorders>
               <w:top w:val="single" w:color="DEDED9" w:sz="6"/>
               <w:left w:val="none" w:color="FFFFFF" w:sz="0"/>
@@ -10445,7 +10468,7 @@
         </w:trPr>
         <w:tc>
           <w:tcPr>
-            <w:tcW w:type="pct" w:w="30%"/>
+            <w:tcW w:type="dxa" w:w="2992"/>
             <w:tcBorders>
               <w:top w:val="single" w:color="DEDED9" w:sz="6"/>
               <w:left w:val="none" w:color="FFFFFF" w:sz="0"/>
@@ -10476,7 +10499,7 @@
         </w:tc>
         <w:tc>
           <w:tcPr>
-            <w:tcW w:type="pct" w:w="70%"/>
+            <w:tcW w:type="dxa" w:w="6980"/>
             <w:tcBorders>
               <w:top w:val="single" w:color="DEDED9" w:sz="6"/>
               <w:left w:val="none" w:color="FFFFFF" w:sz="0"/>
@@ -10514,7 +10537,7 @@
     </w:p>
     <w:tbl>
       <w:tblPr>
-        <w:tblW w:type="pct" w:w="100%"/>
+        <w:tblW w:type="dxa" w:w="9972"/>
         <w:tblBorders>
           <w:top w:val="single" w:color="auto" w:sz="4"/>
           <w:left w:val="single" w:color="auto" w:sz="4"/>
@@ -10523,13 +10546,15 @@
           <w:insideH w:val="single" w:color="auto" w:sz="4"/>
           <w:insideV w:val="single" w:color="auto" w:sz="4"/>
         </w:tblBorders>
+        <w:tblLayout w:type="fixed"/>
       </w:tblPr>
       <w:tblGrid>
-        <w:gridCol w:w="100"/>
+        <w:gridCol w:w="9972"/>
       </w:tblGrid>
       <w:tr>
         <w:tc>
           <w:tcPr>
+            <w:tcW w:type="dxa" w:w="9972"/>
             <w:tcBorders>
               <w:top w:val="none" w:color="FFFFFF" w:sz="0"/>
               <w:left w:val="single" w:color="FCC800" w:sz="36"/>

</xml_diff>

<commit_message>
Paquetes de arranque por docente y cronograma del 15 de octubre
Carpetas docentes/comercial y docentes/administrativo con el brief del
docente, cronograma, sesiones de Teams por perfil, temario, guías, kit,
manual de puntajes, ajustes, política y plantillas. Fechas del Taller 1
y 2 comercial actualizadas en los documentos de ajustes y de propuesta.

Co-Authored-By: Claude Fable 5.1 <noreply@anthropic.com>
Claude-Session: https://claude.ai/code/session_01Ja1vbRoiAwxTq3mLFGrVau
</commit_message>
<xml_diff>
--- a/formacion/Ajustes a los talleres · diagnóstico y política de IA.docx
+++ b/formacion/Ajustes a los talleres · diagnóstico y política de IA.docx
@@ -82,7 +82,7 @@
           <w:sz w:val="21"/>
           <w:szCs w:val="21"/>
         </w:rPr>
-        <w:t xml:space="preserve">Pivot Power · documento de trabajo para la dirección del programa y los dos docentes · 14 de octubre de 2026 · fechas según el cronograma ajustado del 14 de octubre</w:t>
+        <w:t xml:space="preserve">Pivot Power · documento de trabajo para la dirección del programa y los dos docentes · 15 de octubre de 2026 · fechas según el cronograma ajustado del 15 de octubre</w:t>
       </w:r>
     </w:p>
     <w:p>
@@ -193,7 +193,7 @@
                 <w:sz w:val="20"/>
                 <w:szCs w:val="20"/>
               </w:rPr>
-              <w:t xml:space="preserve">Con las fechas corridas una semana, el Taller 1 comercial arranca el viernes 16 de octubre y el administrativo el miércoles 21. Los ajustes del Taller 1 entran completos en los dos encuentros, en el kit del participante y en los retos.</w:t>
+              <w:t xml:space="preserve">Con las fechas corridas, el Taller 1 administrativo arranca el miércoles 21 de octubre y el comercial el viernes 23. Los ajustes del Taller 1 entran completos en los dos encuentros, en el kit del participante y en los retos.</w:t>
             </w:r>
           </w:p>
         </w:tc>
@@ -2623,7 +2623,7 @@
           <w:sz w:val="21"/>
           <w:szCs w:val="21"/>
         </w:rPr>
-        <w:t xml:space="preserve">Encuentro 1 el viernes 16 de octubre, consultorio el miércoles 21, encuentro 2 el viernes 23. Los ajustes entran en los dos encuentros, en el kit y en la evaluación.</w:t>
+        <w:t xml:space="preserve">Encuentro 1 el viernes 23 de octubre, consultorio el miércoles 28, encuentro 2 el viernes 30. Los ajustes entran en los dos encuentros, en el kit y en la evaluación.</w:t>
       </w:r>
     </w:p>
     <w:tbl>
@@ -9453,7 +9453,7 @@
                 <w:sz w:val="19"/>
                 <w:szCs w:val="19"/>
               </w:rPr>
-              <w:t xml:space="preserve">16 de octubre, encuentro 1 comercial</w:t>
+              <w:t xml:space="preserve">21 de octubre, encuentro 1 administrativo</w:t>
             </w:r>
           </w:p>
         </w:tc>
@@ -9582,7 +9582,7 @@
                 <w:sz w:val="19"/>
                 <w:szCs w:val="19"/>
               </w:rPr>
-              <w:t xml:space="preserve">16 de octubre</w:t>
+              <w:t xml:space="preserve">20 de octubre</w:t>
             </w:r>
           </w:p>
         </w:tc>
@@ -10256,7 +10256,7 @@
                 <w:sz w:val="19"/>
                 <w:szCs w:val="19"/>
               </w:rPr>
-              <w:t xml:space="preserve">Fechas del T1: 16 y 23 de octubre comercial, 21 y 28 administrativo. T1 de los dos perfiles: demostración con el archivo del kit y el paso de anonimizar; evaluación con las preguntas 6 y 7 sobre la política. T2 a T5: «Lo que no puede faltar» con los puntos nuevos. Sección 6, estándares: regla de cuenta y de datos.</w:t>
+              <w:t xml:space="preserve">Fechas del T1: 23 y 30 de octubre comercial, 21 y 28 administrativo. T2 comercial: 13 y 20 de noviembre. T1 de los dos perfiles: demostración con el archivo del kit y el paso de anonimizar; evaluación con las preguntas 6 y 7 sobre la política. T2 a T5: «Lo que no puede faltar» con los puntos nuevos. Sección 6, estándares: regla de cuenta y de datos.</w:t>
             </w:r>
           </w:p>
         </w:tc>
@@ -10457,7 +10457,7 @@
                 <w:sz w:val="19"/>
                 <w:szCs w:val="19"/>
               </w:rPr>
-              <w:t xml:space="preserve">La versión ajustada del 14 de octubre reemplaza a la de Drive; la anterior pasa a 09 como superada. En la hoja Jueves de Superpoderes, los retos 5, 10, 17 y 22 con el texto nuevo. En Decisiones y Roles, los retos terminan el 29 de abril y el rol instruccional lo asume la dirección.</w:t>
+              <w:t xml:space="preserve">La versión ajustada del 15 de octubre reemplaza a la de Drive; la anterior pasa a 09 como superada. En la hoja Jueves de Superpoderes, los retos 5, 10, 17 y 22 con el texto nuevo. En Decisiones y Roles, los retos terminan el 29 de abril y el rol instruccional lo asume la dirección.</w:t>
             </w:r>
           </w:p>
         </w:tc>
@@ -10670,7 +10670,7 @@
         <w:sz w:val="16"/>
         <w:szCs w:val="16"/>
       </w:rPr>
-      <w:t xml:space="preserve">Pivot Power · documento de trabajo · 14 de octubre de 2026</w:t>
+      <w:t xml:space="preserve">Pivot Power · documento de trabajo · 15 de octubre de 2026</w:t>
     </w:r>
     <w:r>
       <w:rPr>

</xml_diff>